<commit_message>
finish sdd - srs
</commit_message>
<xml_diff>
--- a/jira_clone/report/final/SDD_ManageWorkflow.docx
+++ b/jira_clone/report/final/SDD_ManageWorkflow.docx
@@ -1745,31 +1745,28 @@
     </w:p>
     <w:tbl>
       <w:tblPr>
+        <w:tblStyle w:val="PlainTable1"/>
         <w:tblW w:w="9360" w:type="dxa"/>
-        <w:tblBorders>
-          <w:top w:val="single" w:sz="4" w:space="0" w:color="D0D7DE"/>
-          <w:bottom w:val="single" w:sz="4" w:space="0" w:color="D0D7DE"/>
-          <w:insideH w:val="single" w:sz="4" w:space="0" w:color="D0D7DE"/>
-        </w:tblBorders>
         <w:tblLook w:val="04A0" w:firstRow="1" w:lastRow="0" w:firstColumn="1" w:lastColumn="0" w:noHBand="0" w:noVBand="1"/>
       </w:tblPr>
       <w:tblGrid>
-        <w:gridCol w:w="2450"/>
-        <w:gridCol w:w="672"/>
-        <w:gridCol w:w="1130"/>
-        <w:gridCol w:w="2227"/>
-        <w:gridCol w:w="2881"/>
+        <w:gridCol w:w="2636"/>
+        <w:gridCol w:w="710"/>
+        <w:gridCol w:w="1206"/>
+        <w:gridCol w:w="2394"/>
+        <w:gridCol w:w="3102"/>
       </w:tblGrid>
       <w:tr>
-        <w:tc>
-          <w:tcPr>
+        <w:trPr>
+          <w:cnfStyle w:val="100000000000" w:firstRow="1" w:lastRow="0" w:firstColumn="0" w:lastColumn="0" w:oddVBand="0" w:evenVBand="0" w:oddHBand="0" w:evenHBand="0" w:firstRowFirstColumn="0" w:firstRowLastColumn="0" w:lastRowFirstColumn="0" w:lastRowLastColumn="0"/>
+        </w:trPr>
+        <w:tc>
+          <w:tcPr>
+            <w:cnfStyle w:val="001000000000" w:firstRow="0" w:lastRow="0" w:firstColumn="1" w:lastColumn="0" w:oddVBand="0" w:evenVBand="0" w:oddHBand="0" w:evenHBand="0" w:firstRowFirstColumn="0" w:firstRowLastColumn="0" w:lastRowFirstColumn="0" w:lastRowLastColumn="0"/>
             <w:tcW w:w="1872" w:type="dxa"/>
           </w:tcPr>
           <w:p>
             <w:r>
-              <w:rPr>
-                <w:b/>
-              </w:rPr>
               <w:t>Method</w:t>
             </w:r>
           </w:p>
@@ -1781,11 +1778,9 @@
           <w:p>
             <w:pPr>
               <w:jc w:val="center"/>
+              <w:cnfStyle w:val="100000000000" w:firstRow="1" w:lastRow="0" w:firstColumn="0" w:lastColumn="0" w:oddVBand="0" w:evenVBand="0" w:oddHBand="0" w:evenHBand="0" w:firstRowFirstColumn="0" w:firstRowLastColumn="0" w:lastRowFirstColumn="0" w:lastRowLastColumn="0"/>
             </w:pPr>
             <w:r>
-              <w:rPr>
-                <w:b/>
-              </w:rPr>
               <w:t>Kind</w:t>
             </w:r>
           </w:p>
@@ -1795,10 +1790,10 @@
             <w:tcW w:w="1872" w:type="dxa"/>
           </w:tcPr>
           <w:p>
-            <w:r>
-              <w:rPr>
-                <w:b/>
-              </w:rPr>
+            <w:pPr>
+              <w:cnfStyle w:val="100000000000" w:firstRow="1" w:lastRow="0" w:firstColumn="0" w:lastColumn="0" w:oddVBand="0" w:evenVBand="0" w:oddHBand="0" w:evenHBand="0" w:firstRowFirstColumn="0" w:firstRowLastColumn="0" w:lastRowFirstColumn="0" w:lastRowLastColumn="0"/>
+            </w:pPr>
+            <w:r>
               <w:t>Params</w:t>
             </w:r>
           </w:p>
@@ -1808,10 +1803,10 @@
             <w:tcW w:w="1872" w:type="dxa"/>
           </w:tcPr>
           <w:p>
-            <w:r>
-              <w:rPr>
-                <w:b/>
-              </w:rPr>
+            <w:pPr>
+              <w:cnfStyle w:val="100000000000" w:firstRow="1" w:lastRow="0" w:firstColumn="0" w:lastColumn="0" w:oddVBand="0" w:evenVBand="0" w:oddHBand="0" w:evenHBand="0" w:firstRowFirstColumn="0" w:firstRowLastColumn="0" w:lastRowFirstColumn="0" w:lastRowLastColumn="0"/>
+            </w:pPr>
+            <w:r>
               <w:t>Returns (`data`)</w:t>
             </w:r>
           </w:p>
@@ -1821,18 +1816,22 @@
             <w:tcW w:w="1872" w:type="dxa"/>
           </w:tcPr>
           <w:p>
-            <w:r>
-              <w:rPr>
-                <w:b/>
-              </w:rPr>
+            <w:pPr>
+              <w:cnfStyle w:val="100000000000" w:firstRow="1" w:lastRow="0" w:firstColumn="0" w:lastColumn="0" w:oddVBand="0" w:evenVBand="0" w:oddHBand="0" w:evenHBand="0" w:firstRowFirstColumn="0" w:firstRowLastColumn="0" w:lastRowFirstColumn="0" w:lastRowLastColumn="0"/>
+            </w:pPr>
+            <w:r>
               <w:t>LWC usage</w:t>
             </w:r>
           </w:p>
         </w:tc>
       </w:tr>
       <w:tr>
-        <w:tc>
-          <w:tcPr>
+        <w:trPr>
+          <w:cnfStyle w:val="000000100000" w:firstRow="0" w:lastRow="0" w:firstColumn="0" w:lastColumn="0" w:oddVBand="0" w:evenVBand="0" w:oddHBand="1" w:evenHBand="0" w:firstRowFirstColumn="0" w:firstRowLastColumn="0" w:lastRowFirstColumn="0" w:lastRowLastColumn="0"/>
+        </w:trPr>
+        <w:tc>
+          <w:tcPr>
+            <w:cnfStyle w:val="001000000000" w:firstRow="0" w:lastRow="0" w:firstColumn="1" w:lastColumn="0" w:oddVBand="0" w:evenVBand="0" w:oddHBand="0" w:evenHBand="0" w:firstRowFirstColumn="0" w:firstRowLastColumn="0" w:lastRowFirstColumn="0" w:lastRowLastColumn="0"/>
             <w:tcW w:w="1872" w:type="dxa"/>
           </w:tcPr>
           <w:p>
@@ -1854,6 +1853,7 @@
           <w:p>
             <w:pPr>
               <w:jc w:val="center"/>
+              <w:cnfStyle w:val="000000100000" w:firstRow="0" w:lastRow="0" w:firstColumn="0" w:lastColumn="0" w:oddVBand="0" w:evenVBand="0" w:oddHBand="1" w:evenHBand="0" w:firstRowFirstColumn="0" w:firstRowLastColumn="0" w:lastRowFirstColumn="0" w:lastRowLastColumn="0"/>
             </w:pPr>
             <w:r>
               <w:t>C</w:t>
@@ -1865,6 +1865,9 @@
             <w:tcW w:w="1872" w:type="dxa"/>
           </w:tcPr>
           <w:p>
+            <w:pPr>
+              <w:cnfStyle w:val="000000100000" w:firstRow="0" w:lastRow="0" w:firstColumn="0" w:lastColumn="0" w:oddVBand="0" w:evenVBand="0" w:oddHBand="1" w:evenHBand="0" w:firstRowFirstColumn="0" w:firstRowLastColumn="0" w:lastRowFirstColumn="0" w:lastRowLastColumn="0"/>
+            </w:pPr>
             <w:proofErr w:type="spellStart"/>
             <w:r>
               <w:rPr>
@@ -1881,6 +1884,9 @@
             <w:tcW w:w="1872" w:type="dxa"/>
           </w:tcPr>
           <w:p>
+            <w:pPr>
+              <w:cnfStyle w:val="000000100000" w:firstRow="0" w:lastRow="0" w:firstColumn="0" w:lastColumn="0" w:oddVBand="0" w:evenVBand="0" w:oddHBand="1" w:evenHBand="0" w:firstRowFirstColumn="0" w:firstRowLastColumn="0" w:lastRowFirstColumn="0" w:lastRowLastColumn="0"/>
+            </w:pPr>
             <w:proofErr w:type="spellStart"/>
             <w:r>
               <w:rPr>
@@ -1936,6 +1942,9 @@
             <w:tcW w:w="1872" w:type="dxa"/>
           </w:tcPr>
           <w:p>
+            <w:pPr>
+              <w:cnfStyle w:val="000000100000" w:firstRow="0" w:lastRow="0" w:firstColumn="0" w:lastColumn="0" w:oddVBand="0" w:evenVBand="0" w:oddHBand="1" w:evenHBand="0" w:firstRowFirstColumn="0" w:firstRowLastColumn="0" w:lastRowFirstColumn="0" w:lastRowLastColumn="0"/>
+            </w:pPr>
             <w:r>
               <w:t>_</w:t>
             </w:r>
@@ -1958,6 +1967,7 @@
       <w:tr>
         <w:tc>
           <w:tcPr>
+            <w:cnfStyle w:val="001000000000" w:firstRow="0" w:lastRow="0" w:firstColumn="1" w:lastColumn="0" w:oddVBand="0" w:evenVBand="0" w:oddHBand="0" w:evenHBand="0" w:firstRowFirstColumn="0" w:firstRowLastColumn="0" w:lastRowFirstColumn="0" w:lastRowLastColumn="0"/>
             <w:tcW w:w="1872" w:type="dxa"/>
           </w:tcPr>
           <w:p>
@@ -1979,6 +1989,7 @@
           <w:p>
             <w:pPr>
               <w:jc w:val="center"/>
+              <w:cnfStyle w:val="000000000000" w:firstRow="0" w:lastRow="0" w:firstColumn="0" w:lastColumn="0" w:oddVBand="0" w:evenVBand="0" w:oddHBand="0" w:evenHBand="0" w:firstRowFirstColumn="0" w:firstRowLastColumn="0" w:lastRowFirstColumn="0" w:lastRowLastColumn="0"/>
             </w:pPr>
             <w:r>
               <w:t>I</w:t>
@@ -1990,6 +2001,9 @@
             <w:tcW w:w="1872" w:type="dxa"/>
           </w:tcPr>
           <w:p>
+            <w:pPr>
+              <w:cnfStyle w:val="000000000000" w:firstRow="0" w:lastRow="0" w:firstColumn="0" w:lastColumn="0" w:oddVBand="0" w:evenVBand="0" w:oddHBand="0" w:evenHBand="0" w:firstRowFirstColumn="0" w:firstRowLastColumn="0" w:lastRowFirstColumn="0" w:lastRowLastColumn="0"/>
+            </w:pPr>
             <w:proofErr w:type="spellStart"/>
             <w:r>
               <w:rPr>
@@ -2006,6 +2020,9 @@
             <w:tcW w:w="1872" w:type="dxa"/>
           </w:tcPr>
           <w:p>
+            <w:pPr>
+              <w:cnfStyle w:val="000000000000" w:firstRow="0" w:lastRow="0" w:firstColumn="0" w:lastColumn="0" w:oddVBand="0" w:evenVBand="0" w:oddHBand="0" w:evenHBand="0" w:firstRowFirstColumn="0" w:firstRowLastColumn="0" w:lastRowFirstColumn="0" w:lastRowLastColumn="0"/>
+            </w:pPr>
             <w:proofErr w:type="spellStart"/>
             <w:r>
               <w:rPr>
@@ -2045,6 +2062,9 @@
             <w:tcW w:w="1872" w:type="dxa"/>
           </w:tcPr>
           <w:p>
+            <w:pPr>
+              <w:cnfStyle w:val="000000000000" w:firstRow="0" w:lastRow="0" w:firstColumn="0" w:lastColumn="0" w:oddVBand="0" w:evenVBand="0" w:oddHBand="0" w:evenHBand="0" w:firstRowFirstColumn="0" w:firstRowLastColumn="0" w:lastRowFirstColumn="0" w:lastRowLastColumn="0"/>
+            </w:pPr>
             <w:r>
               <w:t>_</w:t>
             </w:r>
@@ -2065,8 +2085,12 @@
         </w:tc>
       </w:tr>
       <w:tr>
-        <w:tc>
-          <w:tcPr>
+        <w:trPr>
+          <w:cnfStyle w:val="000000100000" w:firstRow="0" w:lastRow="0" w:firstColumn="0" w:lastColumn="0" w:oddVBand="0" w:evenVBand="0" w:oddHBand="1" w:evenHBand="0" w:firstRowFirstColumn="0" w:firstRowLastColumn="0" w:lastRowFirstColumn="0" w:lastRowLastColumn="0"/>
+        </w:trPr>
+        <w:tc>
+          <w:tcPr>
+            <w:cnfStyle w:val="001000000000" w:firstRow="0" w:lastRow="0" w:firstColumn="1" w:lastColumn="0" w:oddVBand="0" w:evenVBand="0" w:oddHBand="0" w:evenHBand="0" w:firstRowFirstColumn="0" w:firstRowLastColumn="0" w:lastRowFirstColumn="0" w:lastRowLastColumn="0"/>
             <w:tcW w:w="1872" w:type="dxa"/>
           </w:tcPr>
           <w:p>
@@ -2088,6 +2112,7 @@
           <w:p>
             <w:pPr>
               <w:jc w:val="center"/>
+              <w:cnfStyle w:val="000000100000" w:firstRow="0" w:lastRow="0" w:firstColumn="0" w:lastColumn="0" w:oddVBand="0" w:evenVBand="0" w:oddHBand="1" w:evenHBand="0" w:firstRowFirstColumn="0" w:firstRowLastColumn="0" w:lastRowFirstColumn="0" w:lastRowLastColumn="0"/>
             </w:pPr>
             <w:r>
               <w:t>I</w:t>
@@ -2099,6 +2124,9 @@
             <w:tcW w:w="1872" w:type="dxa"/>
           </w:tcPr>
           <w:p>
+            <w:pPr>
+              <w:cnfStyle w:val="000000100000" w:firstRow="0" w:lastRow="0" w:firstColumn="0" w:lastColumn="0" w:oddVBand="0" w:evenVBand="0" w:oddHBand="1" w:evenHBand="0" w:firstRowFirstColumn="0" w:firstRowLastColumn="0" w:lastRowFirstColumn="0" w:lastRowLastColumn="0"/>
+            </w:pPr>
             <w:r>
               <w:rPr>
                 <w:rFonts w:ascii="Consolas" w:eastAsia="Consolas" w:hAnsi="Consolas" w:cs="Consolas"/>
@@ -2122,6 +2150,9 @@
             <w:tcW w:w="1872" w:type="dxa"/>
           </w:tcPr>
           <w:p>
+            <w:pPr>
+              <w:cnfStyle w:val="000000100000" w:firstRow="0" w:lastRow="0" w:firstColumn="0" w:lastColumn="0" w:oddVBand="0" w:evenVBand="0" w:oddHBand="1" w:evenHBand="0" w:firstRowFirstColumn="0" w:firstRowLastColumn="0" w:lastRowFirstColumn="0" w:lastRowLastColumn="0"/>
+            </w:pPr>
             <w:proofErr w:type="spellStart"/>
             <w:r>
               <w:rPr>
@@ -2138,6 +2169,9 @@
             <w:tcW w:w="1872" w:type="dxa"/>
           </w:tcPr>
           <w:p>
+            <w:pPr>
+              <w:cnfStyle w:val="000000100000" w:firstRow="0" w:lastRow="0" w:firstColumn="0" w:lastColumn="0" w:oddVBand="0" w:evenVBand="0" w:oddHBand="1" w:evenHBand="0" w:firstRowFirstColumn="0" w:firstRowLastColumn="0" w:lastRowFirstColumn="0" w:lastRowLastColumn="0"/>
+            </w:pPr>
             <w:r>
               <w:t>Create-Workflow modal → then opens editor on the new id</w:t>
             </w:r>
@@ -2155,12 +2189,8 @@
     </w:p>
     <w:tbl>
       <w:tblPr>
+        <w:tblStyle w:val="PlainTable1"/>
         <w:tblW w:w="9360" w:type="dxa"/>
-        <w:tblBorders>
-          <w:top w:val="single" w:sz="4" w:space="0" w:color="D0D7DE"/>
-          <w:bottom w:val="single" w:sz="4" w:space="0" w:color="D0D7DE"/>
-          <w:insideH w:val="single" w:sz="4" w:space="0" w:color="D0D7DE"/>
-        </w:tblBorders>
         <w:tblLook w:val="04A0" w:firstRow="1" w:lastRow="0" w:firstColumn="1" w:lastColumn="0" w:noHBand="0" w:noVBand="1"/>
       </w:tblPr>
       <w:tblGrid>
@@ -2170,15 +2200,16 @@
         <w:gridCol w:w="2340"/>
       </w:tblGrid>
       <w:tr>
-        <w:tc>
-          <w:tcPr>
+        <w:trPr>
+          <w:cnfStyle w:val="100000000000" w:firstRow="1" w:lastRow="0" w:firstColumn="0" w:lastColumn="0" w:oddVBand="0" w:evenVBand="0" w:oddHBand="0" w:evenHBand="0" w:firstRowFirstColumn="0" w:firstRowLastColumn="0" w:lastRowFirstColumn="0" w:lastRowLastColumn="0"/>
+        </w:trPr>
+        <w:tc>
+          <w:tcPr>
+            <w:cnfStyle w:val="001000000000" w:firstRow="0" w:lastRow="0" w:firstColumn="1" w:lastColumn="0" w:oddVBand="0" w:evenVBand="0" w:oddHBand="0" w:evenHBand="0" w:firstRowFirstColumn="0" w:firstRowLastColumn="0" w:lastRowFirstColumn="0" w:lastRowLastColumn="0"/>
             <w:tcW w:w="2340" w:type="dxa"/>
           </w:tcPr>
           <w:p>
             <w:r>
-              <w:rPr>
-                <w:b/>
-              </w:rPr>
               <w:t>Method</w:t>
             </w:r>
           </w:p>
@@ -2190,11 +2221,9 @@
           <w:p>
             <w:pPr>
               <w:jc w:val="center"/>
+              <w:cnfStyle w:val="100000000000" w:firstRow="1" w:lastRow="0" w:firstColumn="0" w:lastColumn="0" w:oddVBand="0" w:evenVBand="0" w:oddHBand="0" w:evenHBand="0" w:firstRowFirstColumn="0" w:firstRowLastColumn="0" w:lastRowFirstColumn="0" w:lastRowLastColumn="0"/>
             </w:pPr>
             <w:r>
-              <w:rPr>
-                <w:b/>
-              </w:rPr>
               <w:t>Kind</w:t>
             </w:r>
           </w:p>
@@ -2204,10 +2233,10 @@
             <w:tcW w:w="2340" w:type="dxa"/>
           </w:tcPr>
           <w:p>
-            <w:r>
-              <w:rPr>
-                <w:b/>
-              </w:rPr>
+            <w:pPr>
+              <w:cnfStyle w:val="100000000000" w:firstRow="1" w:lastRow="0" w:firstColumn="0" w:lastColumn="0" w:oddVBand="0" w:evenVBand="0" w:oddHBand="0" w:evenHBand="0" w:firstRowFirstColumn="0" w:firstRowLastColumn="0" w:lastRowFirstColumn="0" w:lastRowLastColumn="0"/>
+            </w:pPr>
+            <w:r>
               <w:t>Params</w:t>
             </w:r>
           </w:p>
@@ -2217,18 +2246,22 @@
             <w:tcW w:w="2340" w:type="dxa"/>
           </w:tcPr>
           <w:p>
-            <w:r>
-              <w:rPr>
-                <w:b/>
-              </w:rPr>
+            <w:pPr>
+              <w:cnfStyle w:val="100000000000" w:firstRow="1" w:lastRow="0" w:firstColumn="0" w:lastColumn="0" w:oddVBand="0" w:evenVBand="0" w:oddHBand="0" w:evenHBand="0" w:firstRowFirstColumn="0" w:firstRowLastColumn="0" w:lastRowFirstColumn="0" w:lastRowLastColumn="0"/>
+            </w:pPr>
+            <w:r>
               <w:t>Effect</w:t>
             </w:r>
           </w:p>
         </w:tc>
       </w:tr>
       <w:tr>
-        <w:tc>
-          <w:tcPr>
+        <w:trPr>
+          <w:cnfStyle w:val="000000100000" w:firstRow="0" w:lastRow="0" w:firstColumn="0" w:lastColumn="0" w:oddVBand="0" w:evenVBand="0" w:oddHBand="1" w:evenHBand="0" w:firstRowFirstColumn="0" w:firstRowLastColumn="0" w:lastRowFirstColumn="0" w:lastRowLastColumn="0"/>
+        </w:trPr>
+        <w:tc>
+          <w:tcPr>
+            <w:cnfStyle w:val="001000000000" w:firstRow="0" w:lastRow="0" w:firstColumn="1" w:lastColumn="0" w:oddVBand="0" w:evenVBand="0" w:oddHBand="0" w:evenHBand="0" w:firstRowFirstColumn="0" w:firstRowLastColumn="0" w:lastRowFirstColumn="0" w:lastRowLastColumn="0"/>
             <w:tcW w:w="2340" w:type="dxa"/>
           </w:tcPr>
           <w:p>
@@ -2250,6 +2283,7 @@
           <w:p>
             <w:pPr>
               <w:jc w:val="center"/>
+              <w:cnfStyle w:val="000000100000" w:firstRow="0" w:lastRow="0" w:firstColumn="0" w:lastColumn="0" w:oddVBand="0" w:evenVBand="0" w:oddHBand="1" w:evenHBand="0" w:firstRowFirstColumn="0" w:firstRowLastColumn="0" w:lastRowFirstColumn="0" w:lastRowLastColumn="0"/>
             </w:pPr>
             <w:r>
               <w:t>I</w:t>
@@ -2261,6 +2295,9 @@
             <w:tcW w:w="2340" w:type="dxa"/>
           </w:tcPr>
           <w:p>
+            <w:pPr>
+              <w:cnfStyle w:val="000000100000" w:firstRow="0" w:lastRow="0" w:firstColumn="0" w:lastColumn="0" w:oddVBand="0" w:evenVBand="0" w:oddHBand="1" w:evenHBand="0" w:firstRowFirstColumn="0" w:firstRowLastColumn="0" w:lastRowFirstColumn="0" w:lastRowLastColumn="0"/>
+            </w:pPr>
             <w:r>
               <w:rPr>
                 <w:rFonts w:ascii="Consolas" w:eastAsia="Consolas" w:hAnsi="Consolas" w:cs="Consolas"/>
@@ -2284,6 +2321,9 @@
             <w:tcW w:w="2340" w:type="dxa"/>
           </w:tcPr>
           <w:p>
+            <w:pPr>
+              <w:cnfStyle w:val="000000100000" w:firstRow="0" w:lastRow="0" w:firstColumn="0" w:lastColumn="0" w:oddVBand="0" w:evenVBand="0" w:oddHBand="1" w:evenHBand="0" w:firstRowFirstColumn="0" w:firstRowLastColumn="0" w:lastRowFirstColumn="0" w:lastRowLastColumn="0"/>
+            </w:pPr>
             <w:r>
               <w:rPr>
                 <w:rFonts w:ascii="Consolas" w:eastAsia="Consolas" w:hAnsi="Consolas" w:cs="Consolas"/>
@@ -2355,30 +2395,27 @@
     </w:p>
     <w:tbl>
       <w:tblPr>
+        <w:tblStyle w:val="PlainTable1"/>
         <w:tblW w:w="9360" w:type="dxa"/>
-        <w:tblBorders>
-          <w:top w:val="single" w:sz="4" w:space="0" w:color="D0D7DE"/>
-          <w:bottom w:val="single" w:sz="4" w:space="0" w:color="D0D7DE"/>
-          <w:insideH w:val="single" w:sz="4" w:space="0" w:color="D0D7DE"/>
-        </w:tblBorders>
         <w:tblLook w:val="04A0" w:firstRow="1" w:lastRow="0" w:firstColumn="1" w:lastColumn="0" w:noHBand="0" w:noVBand="1"/>
       </w:tblPr>
       <w:tblGrid>
-        <w:gridCol w:w="2995"/>
-        <w:gridCol w:w="662"/>
-        <w:gridCol w:w="2003"/>
-        <w:gridCol w:w="3700"/>
+        <w:gridCol w:w="3295"/>
+        <w:gridCol w:w="710"/>
+        <w:gridCol w:w="2196"/>
+        <w:gridCol w:w="4076"/>
       </w:tblGrid>
       <w:tr>
-        <w:tc>
-          <w:tcPr>
+        <w:trPr>
+          <w:cnfStyle w:val="100000000000" w:firstRow="1" w:lastRow="0" w:firstColumn="0" w:lastColumn="0" w:oddVBand="0" w:evenVBand="0" w:oddHBand="0" w:evenHBand="0" w:firstRowFirstColumn="0" w:firstRowLastColumn="0" w:lastRowFirstColumn="0" w:lastRowLastColumn="0"/>
+        </w:trPr>
+        <w:tc>
+          <w:tcPr>
+            <w:cnfStyle w:val="001000000000" w:firstRow="0" w:lastRow="0" w:firstColumn="1" w:lastColumn="0" w:oddVBand="0" w:evenVBand="0" w:oddHBand="0" w:evenHBand="0" w:firstRowFirstColumn="0" w:firstRowLastColumn="0" w:lastRowFirstColumn="0" w:lastRowLastColumn="0"/>
             <w:tcW w:w="2340" w:type="dxa"/>
           </w:tcPr>
           <w:p>
             <w:r>
-              <w:rPr>
-                <w:b/>
-              </w:rPr>
               <w:t>Method</w:t>
             </w:r>
           </w:p>
@@ -2390,11 +2427,9 @@
           <w:p>
             <w:pPr>
               <w:jc w:val="center"/>
+              <w:cnfStyle w:val="100000000000" w:firstRow="1" w:lastRow="0" w:firstColumn="0" w:lastColumn="0" w:oddVBand="0" w:evenVBand="0" w:oddHBand="0" w:evenHBand="0" w:firstRowFirstColumn="0" w:firstRowLastColumn="0" w:lastRowFirstColumn="0" w:lastRowLastColumn="0"/>
             </w:pPr>
             <w:r>
-              <w:rPr>
-                <w:b/>
-              </w:rPr>
               <w:t>Kind</w:t>
             </w:r>
           </w:p>
@@ -2404,10 +2439,10 @@
             <w:tcW w:w="2340" w:type="dxa"/>
           </w:tcPr>
           <w:p>
-            <w:r>
-              <w:rPr>
-                <w:b/>
-              </w:rPr>
+            <w:pPr>
+              <w:cnfStyle w:val="100000000000" w:firstRow="1" w:lastRow="0" w:firstColumn="0" w:lastColumn="0" w:oddVBand="0" w:evenVBand="0" w:oddHBand="0" w:evenHBand="0" w:firstRowFirstColumn="0" w:firstRowLastColumn="0" w:lastRowFirstColumn="0" w:lastRowLastColumn="0"/>
+            </w:pPr>
+            <w:r>
               <w:t>Params</w:t>
             </w:r>
           </w:p>
@@ -2417,18 +2452,22 @@
             <w:tcW w:w="2340" w:type="dxa"/>
           </w:tcPr>
           <w:p>
-            <w:r>
-              <w:rPr>
-                <w:b/>
-              </w:rPr>
+            <w:pPr>
+              <w:cnfStyle w:val="100000000000" w:firstRow="1" w:lastRow="0" w:firstColumn="0" w:lastColumn="0" w:oddVBand="0" w:evenVBand="0" w:oddHBand="0" w:evenHBand="0" w:firstRowFirstColumn="0" w:firstRowLastColumn="0" w:lastRowFirstColumn="0" w:lastRowLastColumn="0"/>
+            </w:pPr>
+            <w:r>
               <w:t>Effect</w:t>
             </w:r>
           </w:p>
         </w:tc>
       </w:tr>
       <w:tr>
-        <w:tc>
-          <w:tcPr>
+        <w:trPr>
+          <w:cnfStyle w:val="000000100000" w:firstRow="0" w:lastRow="0" w:firstColumn="0" w:lastColumn="0" w:oddVBand="0" w:evenVBand="0" w:oddHBand="1" w:evenHBand="0" w:firstRowFirstColumn="0" w:firstRowLastColumn="0" w:lastRowFirstColumn="0" w:lastRowLastColumn="0"/>
+        </w:trPr>
+        <w:tc>
+          <w:tcPr>
+            <w:cnfStyle w:val="001000000000" w:firstRow="0" w:lastRow="0" w:firstColumn="1" w:lastColumn="0" w:oddVBand="0" w:evenVBand="0" w:oddHBand="0" w:evenHBand="0" w:firstRowFirstColumn="0" w:firstRowLastColumn="0" w:lastRowFirstColumn="0" w:lastRowLastColumn="0"/>
             <w:tcW w:w="2340" w:type="dxa"/>
           </w:tcPr>
           <w:p>
@@ -2450,6 +2489,7 @@
           <w:p>
             <w:pPr>
               <w:jc w:val="center"/>
+              <w:cnfStyle w:val="000000100000" w:firstRow="0" w:lastRow="0" w:firstColumn="0" w:lastColumn="0" w:oddVBand="0" w:evenVBand="0" w:oddHBand="1" w:evenHBand="0" w:firstRowFirstColumn="0" w:firstRowLastColumn="0" w:lastRowFirstColumn="0" w:lastRowLastColumn="0"/>
             </w:pPr>
             <w:r>
               <w:t>I</w:t>
@@ -2461,6 +2501,9 @@
             <w:tcW w:w="2340" w:type="dxa"/>
           </w:tcPr>
           <w:p>
+            <w:pPr>
+              <w:cnfStyle w:val="000000100000" w:firstRow="0" w:lastRow="0" w:firstColumn="0" w:lastColumn="0" w:oddVBand="0" w:evenVBand="0" w:oddHBand="1" w:evenHBand="0" w:firstRowFirstColumn="0" w:firstRowLastColumn="0" w:lastRowFirstColumn="0" w:lastRowLastColumn="0"/>
+            </w:pPr>
             <w:proofErr w:type="spellStart"/>
             <w:r>
               <w:rPr>
@@ -2509,6 +2552,9 @@
             <w:tcW w:w="2340" w:type="dxa"/>
           </w:tcPr>
           <w:p>
+            <w:pPr>
+              <w:cnfStyle w:val="000000100000" w:firstRow="0" w:lastRow="0" w:firstColumn="0" w:lastColumn="0" w:oddVBand="0" w:evenVBand="0" w:oddHBand="1" w:evenHBand="0" w:firstRowFirstColumn="0" w:firstRowLastColumn="0" w:lastRowFirstColumn="0" w:lastRowLastColumn="0"/>
+            </w:pPr>
             <w:r>
               <w:rPr>
                 <w:rFonts w:ascii="Consolas" w:eastAsia="Consolas" w:hAnsi="Consolas" w:cs="Consolas"/>
@@ -2554,6 +2600,7 @@
       <w:tr>
         <w:tc>
           <w:tcPr>
+            <w:cnfStyle w:val="001000000000" w:firstRow="0" w:lastRow="0" w:firstColumn="1" w:lastColumn="0" w:oddVBand="0" w:evenVBand="0" w:oddHBand="0" w:evenHBand="0" w:firstRowFirstColumn="0" w:firstRowLastColumn="0" w:lastRowFirstColumn="0" w:lastRowLastColumn="0"/>
             <w:tcW w:w="2340" w:type="dxa"/>
           </w:tcPr>
           <w:p>
@@ -2575,6 +2622,7 @@
           <w:p>
             <w:pPr>
               <w:jc w:val="center"/>
+              <w:cnfStyle w:val="000000000000" w:firstRow="0" w:lastRow="0" w:firstColumn="0" w:lastColumn="0" w:oddVBand="0" w:evenVBand="0" w:oddHBand="0" w:evenHBand="0" w:firstRowFirstColumn="0" w:firstRowLastColumn="0" w:lastRowFirstColumn="0" w:lastRowLastColumn="0"/>
             </w:pPr>
             <w:r>
               <w:t>I</w:t>
@@ -2586,6 +2634,9 @@
             <w:tcW w:w="2340" w:type="dxa"/>
           </w:tcPr>
           <w:p>
+            <w:pPr>
+              <w:cnfStyle w:val="000000000000" w:firstRow="0" w:lastRow="0" w:firstColumn="0" w:lastColumn="0" w:oddVBand="0" w:evenVBand="0" w:oddHBand="0" w:evenHBand="0" w:firstRowFirstColumn="0" w:firstRowLastColumn="0" w:lastRowFirstColumn="0" w:lastRowLastColumn="0"/>
+            </w:pPr>
             <w:proofErr w:type="spellStart"/>
             <w:r>
               <w:rPr>
@@ -2602,6 +2653,9 @@
             <w:tcW w:w="2340" w:type="dxa"/>
           </w:tcPr>
           <w:p>
+            <w:pPr>
+              <w:cnfStyle w:val="000000000000" w:firstRow="0" w:lastRow="0" w:firstColumn="0" w:lastColumn="0" w:oddVBand="0" w:evenVBand="0" w:oddHBand="0" w:evenHBand="0" w:firstRowFirstColumn="0" w:firstRowLastColumn="0" w:lastRowFirstColumn="0" w:lastRowLastColumn="0"/>
+            </w:pPr>
             <w:r>
               <w:rPr>
                 <w:rFonts w:ascii="Consolas" w:eastAsia="Consolas" w:hAnsi="Consolas" w:cs="Consolas"/>
@@ -2645,8 +2699,12 @@
         </w:tc>
       </w:tr>
       <w:tr>
-        <w:tc>
-          <w:tcPr>
+        <w:trPr>
+          <w:cnfStyle w:val="000000100000" w:firstRow="0" w:lastRow="0" w:firstColumn="0" w:lastColumn="0" w:oddVBand="0" w:evenVBand="0" w:oddHBand="1" w:evenHBand="0" w:firstRowFirstColumn="0" w:firstRowLastColumn="0" w:lastRowFirstColumn="0" w:lastRowLastColumn="0"/>
+        </w:trPr>
+        <w:tc>
+          <w:tcPr>
+            <w:cnfStyle w:val="001000000000" w:firstRow="0" w:lastRow="0" w:firstColumn="1" w:lastColumn="0" w:oddVBand="0" w:evenVBand="0" w:oddHBand="0" w:evenHBand="0" w:firstRowFirstColumn="0" w:firstRowLastColumn="0" w:lastRowFirstColumn="0" w:lastRowLastColumn="0"/>
             <w:tcW w:w="2340" w:type="dxa"/>
           </w:tcPr>
           <w:p>
@@ -2668,6 +2726,7 @@
           <w:p>
             <w:pPr>
               <w:jc w:val="center"/>
+              <w:cnfStyle w:val="000000100000" w:firstRow="0" w:lastRow="0" w:firstColumn="0" w:lastColumn="0" w:oddVBand="0" w:evenVBand="0" w:oddHBand="1" w:evenHBand="0" w:firstRowFirstColumn="0" w:firstRowLastColumn="0" w:lastRowFirstColumn="0" w:lastRowLastColumn="0"/>
             </w:pPr>
             <w:r>
               <w:t>I</w:t>
@@ -2679,6 +2738,9 @@
             <w:tcW w:w="2340" w:type="dxa"/>
           </w:tcPr>
           <w:p>
+            <w:pPr>
+              <w:cnfStyle w:val="000000100000" w:firstRow="0" w:lastRow="0" w:firstColumn="0" w:lastColumn="0" w:oddVBand="0" w:evenVBand="0" w:oddHBand="1" w:evenHBand="0" w:firstRowFirstColumn="0" w:firstRowLastColumn="0" w:lastRowFirstColumn="0" w:lastRowLastColumn="0"/>
+            </w:pPr>
             <w:proofErr w:type="spellStart"/>
             <w:r>
               <w:rPr>
@@ -2695,6 +2757,9 @@
             <w:tcW w:w="2340" w:type="dxa"/>
           </w:tcPr>
           <w:p>
+            <w:pPr>
+              <w:cnfStyle w:val="000000100000" w:firstRow="0" w:lastRow="0" w:firstColumn="0" w:lastColumn="0" w:oddVBand="0" w:evenVBand="0" w:oddHBand="1" w:evenHBand="0" w:firstRowFirstColumn="0" w:firstRowLastColumn="0" w:lastRowFirstColumn="0" w:lastRowLastColumn="0"/>
+            </w:pPr>
             <w:r>
               <w:rPr>
                 <w:rFonts w:ascii="Consolas" w:eastAsia="Consolas" w:hAnsi="Consolas" w:cs="Consolas"/>
@@ -2724,6 +2789,7 @@
       <w:tr>
         <w:tc>
           <w:tcPr>
+            <w:cnfStyle w:val="001000000000" w:firstRow="0" w:lastRow="0" w:firstColumn="1" w:lastColumn="0" w:oddVBand="0" w:evenVBand="0" w:oddHBand="0" w:evenHBand="0" w:firstRowFirstColumn="0" w:firstRowLastColumn="0" w:lastRowFirstColumn="0" w:lastRowLastColumn="0"/>
             <w:tcW w:w="2340" w:type="dxa"/>
           </w:tcPr>
           <w:p>
@@ -2745,6 +2811,7 @@
           <w:p>
             <w:pPr>
               <w:jc w:val="center"/>
+              <w:cnfStyle w:val="000000000000" w:firstRow="0" w:lastRow="0" w:firstColumn="0" w:lastColumn="0" w:oddVBand="0" w:evenVBand="0" w:oddHBand="0" w:evenHBand="0" w:firstRowFirstColumn="0" w:firstRowLastColumn="0" w:lastRowFirstColumn="0" w:lastRowLastColumn="0"/>
             </w:pPr>
             <w:r>
               <w:t>I</w:t>
@@ -2756,6 +2823,9 @@
             <w:tcW w:w="2340" w:type="dxa"/>
           </w:tcPr>
           <w:p>
+            <w:pPr>
+              <w:cnfStyle w:val="000000000000" w:firstRow="0" w:lastRow="0" w:firstColumn="0" w:lastColumn="0" w:oddVBand="0" w:evenVBand="0" w:oddHBand="0" w:evenHBand="0" w:firstRowFirstColumn="0" w:firstRowLastColumn="0" w:lastRowFirstColumn="0" w:lastRowLastColumn="0"/>
+            </w:pPr>
             <w:proofErr w:type="spellStart"/>
             <w:r>
               <w:rPr>
@@ -2772,6 +2842,9 @@
             <w:tcW w:w="2340" w:type="dxa"/>
           </w:tcPr>
           <w:p>
+            <w:pPr>
+              <w:cnfStyle w:val="000000000000" w:firstRow="0" w:lastRow="0" w:firstColumn="0" w:lastColumn="0" w:oddVBand="0" w:evenVBand="0" w:oddHBand="0" w:evenHBand="0" w:firstRowFirstColumn="0" w:firstRowLastColumn="0" w:lastRowFirstColumn="0" w:lastRowLastColumn="0"/>
+            </w:pPr>
             <w:r>
               <w:rPr>
                 <w:rFonts w:ascii="Consolas" w:eastAsia="Consolas" w:hAnsi="Consolas" w:cs="Consolas"/>
@@ -2793,12 +2866,8 @@
     </w:p>
     <w:tbl>
       <w:tblPr>
+        <w:tblStyle w:val="PlainTable1"/>
         <w:tblW w:w="9360" w:type="dxa"/>
-        <w:tblBorders>
-          <w:top w:val="single" w:sz="4" w:space="0" w:color="D0D7DE"/>
-          <w:bottom w:val="single" w:sz="4" w:space="0" w:color="D0D7DE"/>
-          <w:insideH w:val="single" w:sz="4" w:space="0" w:color="D0D7DE"/>
-        </w:tblBorders>
         <w:tblLook w:val="04A0" w:firstRow="1" w:lastRow="0" w:firstColumn="1" w:lastColumn="0" w:noHBand="0" w:noVBand="1"/>
       </w:tblPr>
       <w:tblGrid>
@@ -2808,15 +2877,16 @@
         <w:gridCol w:w="3284"/>
       </w:tblGrid>
       <w:tr>
-        <w:tc>
-          <w:tcPr>
+        <w:trPr>
+          <w:cnfStyle w:val="100000000000" w:firstRow="1" w:lastRow="0" w:firstColumn="0" w:lastColumn="0" w:oddVBand="0" w:evenVBand="0" w:oddHBand="0" w:evenHBand="0" w:firstRowFirstColumn="0" w:firstRowLastColumn="0" w:lastRowFirstColumn="0" w:lastRowLastColumn="0"/>
+        </w:trPr>
+        <w:tc>
+          <w:tcPr>
+            <w:cnfStyle w:val="001000000000" w:firstRow="0" w:lastRow="0" w:firstColumn="1" w:lastColumn="0" w:oddVBand="0" w:evenVBand="0" w:oddHBand="0" w:evenHBand="0" w:firstRowFirstColumn="0" w:firstRowLastColumn="0" w:lastRowFirstColumn="0" w:lastRowLastColumn="0"/>
             <w:tcW w:w="2340" w:type="dxa"/>
           </w:tcPr>
           <w:p>
             <w:r>
-              <w:rPr>
-                <w:b/>
-              </w:rPr>
               <w:t>Method</w:t>
             </w:r>
           </w:p>
@@ -2828,11 +2898,9 @@
           <w:p>
             <w:pPr>
               <w:jc w:val="center"/>
+              <w:cnfStyle w:val="100000000000" w:firstRow="1" w:lastRow="0" w:firstColumn="0" w:lastColumn="0" w:oddVBand="0" w:evenVBand="0" w:oddHBand="0" w:evenHBand="0" w:firstRowFirstColumn="0" w:firstRowLastColumn="0" w:lastRowFirstColumn="0" w:lastRowLastColumn="0"/>
             </w:pPr>
             <w:r>
-              <w:rPr>
-                <w:b/>
-              </w:rPr>
               <w:t>Kind</w:t>
             </w:r>
           </w:p>
@@ -2842,10 +2910,10 @@
             <w:tcW w:w="2340" w:type="dxa"/>
           </w:tcPr>
           <w:p>
-            <w:r>
-              <w:rPr>
-                <w:b/>
-              </w:rPr>
+            <w:pPr>
+              <w:cnfStyle w:val="100000000000" w:firstRow="1" w:lastRow="0" w:firstColumn="0" w:lastColumn="0" w:oddVBand="0" w:evenVBand="0" w:oddHBand="0" w:evenHBand="0" w:firstRowFirstColumn="0" w:firstRowLastColumn="0" w:lastRowFirstColumn="0" w:lastRowLastColumn="0"/>
+            </w:pPr>
+            <w:r>
               <w:t>Params</w:t>
             </w:r>
           </w:p>
@@ -2855,18 +2923,22 @@
             <w:tcW w:w="2340" w:type="dxa"/>
           </w:tcPr>
           <w:p>
-            <w:r>
-              <w:rPr>
-                <w:b/>
-              </w:rPr>
+            <w:pPr>
+              <w:cnfStyle w:val="100000000000" w:firstRow="1" w:lastRow="0" w:firstColumn="0" w:lastColumn="0" w:oddVBand="0" w:evenVBand="0" w:oddHBand="0" w:evenHBand="0" w:firstRowFirstColumn="0" w:firstRowLastColumn="0" w:lastRowFirstColumn="0" w:lastRowLastColumn="0"/>
+            </w:pPr>
+            <w:r>
               <w:t>Effect</w:t>
             </w:r>
           </w:p>
         </w:tc>
       </w:tr>
       <w:tr>
-        <w:tc>
-          <w:tcPr>
+        <w:trPr>
+          <w:cnfStyle w:val="000000100000" w:firstRow="0" w:lastRow="0" w:firstColumn="0" w:lastColumn="0" w:oddVBand="0" w:evenVBand="0" w:oddHBand="1" w:evenHBand="0" w:firstRowFirstColumn="0" w:firstRowLastColumn="0" w:lastRowFirstColumn="0" w:lastRowLastColumn="0"/>
+        </w:trPr>
+        <w:tc>
+          <w:tcPr>
+            <w:cnfStyle w:val="001000000000" w:firstRow="0" w:lastRow="0" w:firstColumn="1" w:lastColumn="0" w:oddVBand="0" w:evenVBand="0" w:oddHBand="0" w:evenHBand="0" w:firstRowFirstColumn="0" w:firstRowLastColumn="0" w:lastRowFirstColumn="0" w:lastRowLastColumn="0"/>
             <w:tcW w:w="2340" w:type="dxa"/>
           </w:tcPr>
           <w:p>
@@ -2888,6 +2960,7 @@
           <w:p>
             <w:pPr>
               <w:jc w:val="center"/>
+              <w:cnfStyle w:val="000000100000" w:firstRow="0" w:lastRow="0" w:firstColumn="0" w:lastColumn="0" w:oddVBand="0" w:evenVBand="0" w:oddHBand="1" w:evenHBand="0" w:firstRowFirstColumn="0" w:firstRowLastColumn="0" w:lastRowFirstColumn="0" w:lastRowLastColumn="0"/>
             </w:pPr>
             <w:r>
               <w:t>C</w:t>
@@ -2899,6 +2972,9 @@
             <w:tcW w:w="2340" w:type="dxa"/>
           </w:tcPr>
           <w:p>
+            <w:pPr>
+              <w:cnfStyle w:val="000000100000" w:firstRow="0" w:lastRow="0" w:firstColumn="0" w:lastColumn="0" w:oddVBand="0" w:evenVBand="0" w:oddHBand="1" w:evenHBand="0" w:firstRowFirstColumn="0" w:firstRowLastColumn="0" w:lastRowFirstColumn="0" w:lastRowLastColumn="0"/>
+            </w:pPr>
             <w:proofErr w:type="spellStart"/>
             <w:r>
               <w:rPr>
@@ -2915,6 +2991,9 @@
             <w:tcW w:w="2340" w:type="dxa"/>
           </w:tcPr>
           <w:p>
+            <w:pPr>
+              <w:cnfStyle w:val="000000100000" w:firstRow="0" w:lastRow="0" w:firstColumn="0" w:lastColumn="0" w:oddVBand="0" w:evenVBand="0" w:oddHBand="1" w:evenHBand="0" w:firstRowFirstColumn="0" w:firstRowLastColumn="0" w:lastRowFirstColumn="0" w:lastRowLastColumn="0"/>
+            </w:pPr>
             <w:proofErr w:type="spellStart"/>
             <w:r>
               <w:rPr>
@@ -2953,6 +3032,7 @@
       <w:tr>
         <w:tc>
           <w:tcPr>
+            <w:cnfStyle w:val="001000000000" w:firstRow="0" w:lastRow="0" w:firstColumn="1" w:lastColumn="0" w:oddVBand="0" w:evenVBand="0" w:oddHBand="0" w:evenHBand="0" w:firstRowFirstColumn="0" w:firstRowLastColumn="0" w:lastRowFirstColumn="0" w:lastRowLastColumn="0"/>
             <w:tcW w:w="2340" w:type="dxa"/>
           </w:tcPr>
           <w:p>
@@ -2974,6 +3054,7 @@
           <w:p>
             <w:pPr>
               <w:jc w:val="center"/>
+              <w:cnfStyle w:val="000000000000" w:firstRow="0" w:lastRow="0" w:firstColumn="0" w:lastColumn="0" w:oddVBand="0" w:evenVBand="0" w:oddHBand="0" w:evenHBand="0" w:firstRowFirstColumn="0" w:firstRowLastColumn="0" w:lastRowFirstColumn="0" w:lastRowLastColumn="0"/>
             </w:pPr>
             <w:r>
               <w:t>I</w:t>
@@ -2985,6 +3066,9 @@
             <w:tcW w:w="2340" w:type="dxa"/>
           </w:tcPr>
           <w:p>
+            <w:pPr>
+              <w:cnfStyle w:val="000000000000" w:firstRow="0" w:lastRow="0" w:firstColumn="0" w:lastColumn="0" w:oddVBand="0" w:evenVBand="0" w:oddHBand="0" w:evenHBand="0" w:firstRowFirstColumn="0" w:firstRowLastColumn="0" w:lastRowFirstColumn="0" w:lastRowLastColumn="0"/>
+            </w:pPr>
             <w:proofErr w:type="spellStart"/>
             <w:r>
               <w:rPr>
@@ -3024,6 +3108,9 @@
             <w:tcW w:w="2340" w:type="dxa"/>
           </w:tcPr>
           <w:p>
+            <w:pPr>
+              <w:cnfStyle w:val="000000000000" w:firstRow="0" w:lastRow="0" w:firstColumn="0" w:lastColumn="0" w:oddVBand="0" w:evenVBand="0" w:oddHBand="0" w:evenHBand="0" w:firstRowFirstColumn="0" w:firstRowLastColumn="0" w:lastRowFirstColumn="0" w:lastRowLastColumn="0"/>
+            </w:pPr>
             <w:r>
               <w:rPr>
                 <w:rFonts w:ascii="Consolas" w:eastAsia="Consolas" w:hAnsi="Consolas" w:cs="Consolas"/>
@@ -3045,15 +3132,7 @@
                 <w:rFonts w:ascii="Consolas" w:eastAsia="Consolas" w:hAnsi="Consolas" w:cs="Consolas"/>
                 <w:sz w:val="18"/>
               </w:rPr>
-              <w:t xml:space="preserve">__c; returns it → </w:t>
-            </w:r>
-            <w:r>
-              <w:rPr>
-                <w:rFonts w:ascii="Consolas" w:eastAsia="Consolas" w:hAnsi="Consolas" w:cs="Consolas"/>
-                <w:sz w:val="18"/>
-              </w:rPr>
-              <w:lastRenderedPageBreak/>
-              <w:t>_</w:t>
+              <w:t>__c; returns it → _</w:t>
             </w:r>
             <w:proofErr w:type="spellStart"/>
             <w:proofErr w:type="gramStart"/>
@@ -3291,10 +3370,7 @@
         <w:pStyle w:val="Heading2"/>
       </w:pPr>
       <w:r>
-        <w:t>3</w:t>
-      </w:r>
-      <w:r>
-        <w:t>. UI / UX Specification</w:t>
+        <w:t>3. UI / UX Specification</w:t>
       </w:r>
     </w:p>
     <w:p>
@@ -3302,10 +3378,7 @@
         <w:pStyle w:val="Heading3"/>
       </w:pPr>
       <w:r>
-        <w:t>3</w:t>
-      </w:r>
-      <w:r>
-        <w:t>.1 Step 1 — project picker</w:t>
+        <w:t>3.1 Step 1 — project picker</w:t>
       </w:r>
     </w:p>
     <w:p>
@@ -3330,33 +3403,69 @@
       </w:r>
     </w:p>
     <w:p>
-      <w:r>
-        <w:rPr>
-          <w:rFonts w:ascii="Consolas" w:eastAsia="Consolas" w:hAnsi="Consolas" w:cs="Consolas"/>
+      <w:pPr>
+        <w:jc w:val="center"/>
+      </w:pPr>
+      <w:r>
+        <w:rPr>
+          <w:rFonts w:ascii="Consolas" w:hAnsi="Consolas" w:cs="Consolas"/>
+          <w:color w:val="9AA0A6"/>
           <w:sz w:val="16"/>
+          <w:szCs w:val="16"/>
         </w:rPr>
         <w:t>###########################</w:t>
       </w:r>
     </w:p>
     <w:p>
       <w:pPr>
-        <w:pBdr>
-          <w:bottom w:val="thinThickThinMediumGap" w:sz="18" w:space="1" w:color="auto"/>
-        </w:pBdr>
-      </w:pPr>
-      <w:r>
-        <w:rPr>
-          <w:rFonts w:ascii="Consolas" w:eastAsia="Consolas" w:hAnsi="Consolas" w:cs="Consolas"/>
+        <w:jc w:val="center"/>
+      </w:pPr>
+      <w:r>
+        <w:rPr>
+          <w:b/>
+          <w:bCs/>
+          <w:color w:val="0F4761"/>
+          <w:sz w:val="20"/>
+          <w:szCs w:val="20"/>
+        </w:rPr>
+        <w:t>Manage-workflow-choose-project</w:t>
+      </w:r>
+      <w:r>
+        <w:rPr>
+          <w:b/>
+          <w:bCs/>
+          <w:color w:val="0F4761"/>
+          <w:sz w:val="20"/>
+          <w:szCs w:val="20"/>
+        </w:rPr>
+        <w:t>.png</w:t>
+      </w:r>
+    </w:p>
+    <w:p>
+      <w:pPr>
+        <w:jc w:val="center"/>
+      </w:pPr>
+      <w:r>
+        <w:rPr>
+          <w:rFonts w:ascii="Consolas" w:hAnsi="Consolas" w:cs="Consolas"/>
+          <w:color w:val="9AA0A6"/>
           <w:sz w:val="16"/>
-        </w:rPr>
-        <w:t>manage-workflow-choose-project.png</w:t>
-      </w:r>
-    </w:p>
-    <w:p>
-      <w:r>
+          <w:szCs w:val="16"/>
+        </w:rPr>
+        <w:t>###########################</w:t>
+      </w:r>
+    </w:p>
+    <w:p>
+      <w:pPr>
+        <w:ind w:left="2160" w:firstLine="720"/>
+      </w:pPr>
+      <w:r>
+        <w:rPr>
+          <w:noProof/>
+        </w:rPr>
         <w:drawing>
-          <wp:inline distT="0" distB="0" distL="0" distR="0" wp14:anchorId="30576916" wp14:editId="47F45D68">
-            <wp:extent cx="5943600" cy="2366645"/>
+          <wp:inline distT="0" distB="0" distL="0" distR="0" wp14:anchorId="30576916" wp14:editId="1C5E1E85">
+            <wp:extent cx="2270760" cy="1874520"/>
             <wp:effectExtent l="0" t="0" r="0" b="0"/>
             <wp:docPr id="787730092" name="Picture 1"/>
             <wp:cNvGraphicFramePr>
@@ -3369,20 +3478,29 @@
                     <pic:cNvPr id="787730092" name=""/>
                     <pic:cNvPicPr/>
                   </pic:nvPicPr>
-                  <pic:blipFill>
+                  <pic:blipFill rotWithShape="1">
                     <a:blip r:embed="rId6"/>
+                    <a:srcRect l="27308" t="10625" r="34487" b="10169"/>
                     <a:stretch>
                       <a:fillRect/>
                     </a:stretch>
                   </pic:blipFill>
-                  <pic:spPr>
+                  <pic:spPr bwMode="auto">
                     <a:xfrm>
                       <a:off x="0" y="0"/>
-                      <a:ext cx="5943600" cy="2366645"/>
+                      <a:ext cx="2270760" cy="1874520"/>
                     </a:xfrm>
                     <a:prstGeom prst="rect">
                       <a:avLst/>
                     </a:prstGeom>
+                    <a:ln>
+                      <a:noFill/>
+                    </a:ln>
+                    <a:extLst>
+                      <a:ext uri="{53640926-AAD7-44D8-BBD7-CCE9431645EC}">
+                        <a14:shadowObscured xmlns:a14="http://schemas.microsoft.com/office/drawing/2010/main"/>
+                      </a:ext>
+                    </a:extLst>
                   </pic:spPr>
                 </pic:pic>
               </a:graphicData>
@@ -3409,46 +3527,139 @@
         <w:pStyle w:val="Heading3"/>
       </w:pPr>
       <w:r>
-        <w:t>3</w:t>
-      </w:r>
-      <w:r>
-        <w:t>.2 Step 2 — workflow list</w:t>
-      </w:r>
-    </w:p>
-    <w:p>
-      <w:r>
-        <w:t xml:space="preserve">With a project but no workflow selected the page shows the “Workflows” heading, a Create New Workflow button, and one card per workflow (name + record status) each with an Edit button; an empty project shows “No workflows for this project yet — create one to </w:t>
-      </w:r>
-      <w:r>
+        <w:t>3.2 Step 2 — workflow list</w:t>
+      </w:r>
+    </w:p>
+    <w:p>
+      <w:r>
+        <w:t>With a project but no workflow selected the page shows the “Workflows” heading, a Create New Workflow button, and one card per workflow (name + record status) each with an Edit button; an empty project shows “No workflows for this project yet — create one to get started.” The Create New Workflow modal takes a name and, on success, opens the editor on the new workflow.</w:t>
+      </w:r>
+    </w:p>
+    <w:p>
+      <w:pPr>
+        <w:jc w:val="center"/>
+        <w:rPr>
+          <w:rFonts w:ascii="Consolas" w:hAnsi="Consolas" w:cs="Consolas"/>
+          <w:color w:val="9AA0A6"/>
+          <w:sz w:val="16"/>
+          <w:szCs w:val="16"/>
+        </w:rPr>
+      </w:pPr>
+    </w:p>
+    <w:p>
+      <w:pPr>
+        <w:jc w:val="center"/>
+        <w:rPr>
+          <w:rFonts w:ascii="Consolas" w:hAnsi="Consolas" w:cs="Consolas"/>
+          <w:color w:val="9AA0A6"/>
+          <w:sz w:val="16"/>
+          <w:szCs w:val="16"/>
+        </w:rPr>
+      </w:pPr>
+    </w:p>
+    <w:p>
+      <w:pPr>
+        <w:jc w:val="center"/>
+        <w:rPr>
+          <w:rFonts w:ascii="Consolas" w:hAnsi="Consolas" w:cs="Consolas"/>
+          <w:color w:val="9AA0A6"/>
+          <w:sz w:val="16"/>
+          <w:szCs w:val="16"/>
+        </w:rPr>
+      </w:pPr>
+    </w:p>
+    <w:p>
+      <w:pPr>
+        <w:jc w:val="center"/>
+        <w:rPr>
+          <w:rFonts w:ascii="Consolas" w:hAnsi="Consolas" w:cs="Consolas"/>
+          <w:color w:val="9AA0A6"/>
+          <w:sz w:val="16"/>
+          <w:szCs w:val="16"/>
+        </w:rPr>
+      </w:pPr>
+    </w:p>
+    <w:p>
+      <w:pPr>
+        <w:jc w:val="center"/>
+        <w:rPr>
+          <w:rFonts w:ascii="Consolas" w:hAnsi="Consolas" w:cs="Consolas"/>
+          <w:color w:val="9AA0A6"/>
+          <w:sz w:val="16"/>
+          <w:szCs w:val="16"/>
+        </w:rPr>
+      </w:pPr>
+    </w:p>
+    <w:p>
+      <w:pPr>
+        <w:jc w:val="center"/>
+        <w:rPr>
+          <w:rFonts w:ascii="Consolas" w:hAnsi="Consolas" w:cs="Consolas"/>
+          <w:color w:val="9AA0A6"/>
+          <w:sz w:val="16"/>
+          <w:szCs w:val="16"/>
+        </w:rPr>
+      </w:pPr>
+    </w:p>
+    <w:p>
+      <w:pPr>
+        <w:jc w:val="center"/>
+      </w:pPr>
+      <w:r>
+        <w:rPr>
+          <w:rFonts w:ascii="Consolas" w:hAnsi="Consolas" w:cs="Consolas"/>
+          <w:color w:val="9AA0A6"/>
+          <w:sz w:val="16"/>
+          <w:szCs w:val="16"/>
+        </w:rPr>
         <w:lastRenderedPageBreak/>
-        <w:t>get started.” The Create New Workflow modal takes a name and, on success, opens the editor on the new workflow.</w:t>
-      </w:r>
-    </w:p>
-    <w:p>
-      <w:r>
-        <w:rPr>
-          <w:rFonts w:ascii="Consolas" w:eastAsia="Consolas" w:hAnsi="Consolas" w:cs="Consolas"/>
+        <w:t>###########################</w:t>
+      </w:r>
+    </w:p>
+    <w:p>
+      <w:pPr>
+        <w:jc w:val="center"/>
+      </w:pPr>
+      <w:r>
+        <w:rPr>
+          <w:b/>
+          <w:bCs/>
+          <w:color w:val="0F4761"/>
+          <w:sz w:val="20"/>
+          <w:szCs w:val="20"/>
+        </w:rPr>
+        <w:t>Manage-workflow-list</w:t>
+      </w:r>
+      <w:r>
+        <w:rPr>
+          <w:b/>
+          <w:bCs/>
+          <w:color w:val="0F4761"/>
+          <w:sz w:val="20"/>
+          <w:szCs w:val="20"/>
+        </w:rPr>
+        <w:t>.png</w:t>
+      </w:r>
+    </w:p>
+    <w:p>
+      <w:pPr>
+        <w:jc w:val="center"/>
+      </w:pPr>
+      <w:r>
+        <w:rPr>
+          <w:rFonts w:ascii="Consolas" w:hAnsi="Consolas" w:cs="Consolas"/>
+          <w:color w:val="9AA0A6"/>
           <w:sz w:val="16"/>
+          <w:szCs w:val="16"/>
         </w:rPr>
         <w:t>###########################</w:t>
       </w:r>
     </w:p>
     <w:p>
-      <w:pPr>
-        <w:pBdr>
-          <w:bottom w:val="thinThickThinMediumGap" w:sz="18" w:space="1" w:color="auto"/>
-        </w:pBdr>
-      </w:pPr>
-      <w:r>
-        <w:rPr>
-          <w:rFonts w:ascii="Consolas" w:eastAsia="Consolas" w:hAnsi="Consolas" w:cs="Consolas"/>
-          <w:sz w:val="16"/>
-        </w:rPr>
-        <w:t>manage-workflow-list.png</w:t>
-      </w:r>
-    </w:p>
-    <w:p>
-      <w:r>
+      <w:r>
+        <w:rPr>
+          <w:noProof/>
+        </w:rPr>
         <w:drawing>
           <wp:inline distT="0" distB="0" distL="0" distR="0" wp14:anchorId="276FEA91" wp14:editId="6CCCC61B">
             <wp:extent cx="5943600" cy="1424940"/>
@@ -3490,41 +3701,95 @@
     <w:p>
       <w:pPr>
         <w:jc w:val="center"/>
-      </w:pPr>
-      <w:r>
         <w:rPr>
           <w:i/>
           <w:color w:val="6B778C"/>
           <w:sz w:val="18"/>
         </w:rPr>
+      </w:pPr>
+      <w:r>
+        <w:rPr>
+          <w:i/>
+          <w:color w:val="6B778C"/>
+          <w:sz w:val="18"/>
+        </w:rPr>
         <w:t>The workflow list: “Workflows” heading, “Create New Workflow” button, and workflow cards (name + record status + Edit).</w:t>
       </w:r>
     </w:p>
     <w:p>
-      <w:r>
-        <w:rPr>
-          <w:rFonts w:ascii="Consolas" w:eastAsia="Consolas" w:hAnsi="Consolas" w:cs="Consolas"/>
+      <w:pPr>
+        <w:jc w:val="center"/>
+        <w:rPr>
+          <w:i/>
+          <w:color w:val="6B778C"/>
+          <w:sz w:val="18"/>
+        </w:rPr>
+      </w:pPr>
+    </w:p>
+    <w:p>
+      <w:pPr>
+        <w:jc w:val="center"/>
+      </w:pPr>
+      <w:r>
+        <w:rPr>
+          <w:rFonts w:ascii="Consolas" w:hAnsi="Consolas" w:cs="Consolas"/>
+          <w:color w:val="9AA0A6"/>
           <w:sz w:val="16"/>
+          <w:szCs w:val="16"/>
         </w:rPr>
         <w:t>###########################</w:t>
       </w:r>
     </w:p>
     <w:p>
       <w:pPr>
-        <w:pBdr>
-          <w:bottom w:val="thinThickThinMediumGap" w:sz="18" w:space="1" w:color="auto"/>
-        </w:pBdr>
-      </w:pPr>
-      <w:r>
-        <w:rPr>
-          <w:rFonts w:ascii="Consolas" w:eastAsia="Consolas" w:hAnsi="Consolas" w:cs="Consolas"/>
+        <w:jc w:val="center"/>
+      </w:pPr>
+      <w:r>
+        <w:rPr>
+          <w:b/>
+          <w:bCs/>
+          <w:color w:val="0F4761"/>
+          <w:sz w:val="20"/>
+          <w:szCs w:val="20"/>
+        </w:rPr>
+        <w:t>Manage-workflow-create-modal</w:t>
+      </w:r>
+      <w:r>
+        <w:rPr>
+          <w:b/>
+          <w:bCs/>
+          <w:color w:val="0F4761"/>
+          <w:sz w:val="20"/>
+          <w:szCs w:val="20"/>
+        </w:rPr>
+        <w:t>.png</w:t>
+      </w:r>
+    </w:p>
+    <w:p>
+      <w:pPr>
+        <w:jc w:val="center"/>
+      </w:pPr>
+      <w:r>
+        <w:rPr>
+          <w:rFonts w:ascii="Consolas" w:hAnsi="Consolas" w:cs="Consolas"/>
+          <w:color w:val="9AA0A6"/>
           <w:sz w:val="16"/>
-        </w:rPr>
-        <w:t>manage-workflow-create-modal.png</w:t>
-      </w:r>
-    </w:p>
-    <w:p>
-      <w:r>
+          <w:szCs w:val="16"/>
+        </w:rPr>
+        <w:t>###########################</w:t>
+      </w:r>
+    </w:p>
+    <w:p>
+      <w:pPr>
+        <w:ind w:left="2160"/>
+      </w:pPr>
+      <w:r>
+        <w:t xml:space="preserve">            </w:t>
+      </w:r>
+      <w:r>
+        <w:rPr>
+          <w:noProof/>
+        </w:rPr>
         <w:drawing>
           <wp:inline distT="0" distB="0" distL="0" distR="0" wp14:anchorId="557A4053" wp14:editId="4E0297A1">
             <wp:extent cx="2600688" cy="1952898"/>
@@ -3580,10 +3845,7 @@
         <w:pStyle w:val="Heading3"/>
       </w:pPr>
       <w:r>
-        <w:t>3</w:t>
-      </w:r>
-      <w:r>
-        <w:t>.3 Step 3 — the visual editor (toolbar, legend, canvas)</w:t>
+        <w:t>3.3 Step 3 — the visual editor (toolbar, legend, canvas)</w:t>
       </w:r>
     </w:p>
     <w:p>
@@ -3600,34 +3862,77 @@
       </w:r>
     </w:p>
     <w:p>
-      <w:r>
-        <w:rPr>
-          <w:rFonts w:ascii="Consolas" w:eastAsia="Consolas" w:hAnsi="Consolas" w:cs="Consolas"/>
+      <w:pPr>
+        <w:jc w:val="center"/>
+      </w:pPr>
+      <w:r>
+        <w:rPr>
+          <w:rFonts w:ascii="Consolas" w:hAnsi="Consolas" w:cs="Consolas"/>
+          <w:color w:val="9AA0A6"/>
           <w:sz w:val="16"/>
+          <w:szCs w:val="16"/>
         </w:rPr>
         <w:t>###########################</w:t>
       </w:r>
     </w:p>
     <w:p>
       <w:pPr>
-        <w:pBdr>
-          <w:bottom w:val="thinThickThinMediumGap" w:sz="18" w:space="1" w:color="auto"/>
-        </w:pBdr>
-      </w:pPr>
-      <w:r>
-        <w:rPr>
-          <w:rFonts w:ascii="Consolas" w:eastAsia="Consolas" w:hAnsi="Consolas" w:cs="Consolas"/>
+        <w:jc w:val="center"/>
+      </w:pPr>
+      <w:r>
+        <w:rPr>
+          <w:b/>
+          <w:bCs/>
+          <w:color w:val="0F4761"/>
+          <w:sz w:val="20"/>
+          <w:szCs w:val="20"/>
+        </w:rPr>
+        <w:t>Manage-workflow-</w:t>
+      </w:r>
+      <w:r>
+        <w:rPr>
+          <w:b/>
+          <w:bCs/>
+          <w:color w:val="0F4761"/>
+          <w:sz w:val="20"/>
+          <w:szCs w:val="20"/>
+        </w:rPr>
+        <w:t>editor</w:t>
+      </w:r>
+      <w:r>
+        <w:rPr>
+          <w:b/>
+          <w:bCs/>
+          <w:color w:val="0F4761"/>
+          <w:sz w:val="20"/>
+          <w:szCs w:val="20"/>
+        </w:rPr>
+        <w:t>.png</w:t>
+      </w:r>
+    </w:p>
+    <w:p>
+      <w:pPr>
+        <w:jc w:val="center"/>
+      </w:pPr>
+      <w:r>
+        <w:rPr>
+          <w:rFonts w:ascii="Consolas" w:hAnsi="Consolas" w:cs="Consolas"/>
+          <w:color w:val="9AA0A6"/>
           <w:sz w:val="16"/>
-        </w:rPr>
-        <w:t>manage-workflow-editor.png</w:t>
-      </w:r>
-    </w:p>
-    <w:p>
-      <w:r>
+          <w:szCs w:val="16"/>
+        </w:rPr>
+        <w:t>###########################</w:t>
+      </w:r>
+    </w:p>
+    <w:p>
+      <w:r>
+        <w:rPr>
+          <w:noProof/>
+        </w:rPr>
         <w:lastRenderedPageBreak/>
         <w:drawing>
-          <wp:inline distT="0" distB="0" distL="0" distR="0" wp14:anchorId="64683015" wp14:editId="75DADCB6">
-            <wp:extent cx="5943600" cy="2552700"/>
+          <wp:inline distT="0" distB="0" distL="0" distR="0" wp14:anchorId="64683015" wp14:editId="549FC025">
+            <wp:extent cx="5562600" cy="2389065"/>
             <wp:effectExtent l="0" t="0" r="0" b="0"/>
             <wp:docPr id="137081058" name="Picture 1"/>
             <wp:cNvGraphicFramePr>
@@ -3649,7 +3954,7 @@
                   <pic:spPr>
                     <a:xfrm>
                       <a:off x="0" y="0"/>
-                      <a:ext cx="5943600" cy="2552700"/>
+                      <a:ext cx="5614028" cy="2411153"/>
                     </a:xfrm>
                     <a:prstGeom prst="rect">
                       <a:avLst/>
@@ -3680,10 +3985,7 @@
         <w:pStyle w:val="Heading3"/>
       </w:pPr>
       <w:r>
-        <w:t>3</w:t>
-      </w:r>
-      <w:r>
-        <w:t>.4 Status nodes &amp; selection</w:t>
+        <w:t>3.4 Status nodes &amp; selection</w:t>
       </w:r>
     </w:p>
     <w:p>
@@ -3716,30 +4018,76 @@
       </w:r>
     </w:p>
     <w:p>
-      <w:r>
-        <w:rPr>
-          <w:rFonts w:ascii="Consolas" w:eastAsia="Consolas" w:hAnsi="Consolas" w:cs="Consolas"/>
+      <w:pPr>
+        <w:jc w:val="center"/>
+      </w:pPr>
+      <w:r>
+        <w:rPr>
+          <w:rFonts w:ascii="Consolas" w:hAnsi="Consolas" w:cs="Consolas"/>
+          <w:color w:val="9AA0A6"/>
           <w:sz w:val="16"/>
+          <w:szCs w:val="16"/>
         </w:rPr>
         <w:t>###########################</w:t>
       </w:r>
     </w:p>
     <w:p>
       <w:pPr>
-        <w:pBdr>
-          <w:bottom w:val="thinThickThinMediumGap" w:sz="18" w:space="1" w:color="auto"/>
-        </w:pBdr>
-      </w:pPr>
-      <w:r>
-        <w:rPr>
-          <w:rFonts w:ascii="Consolas" w:eastAsia="Consolas" w:hAnsi="Consolas" w:cs="Consolas"/>
+        <w:jc w:val="center"/>
+      </w:pPr>
+      <w:r>
+        <w:rPr>
+          <w:b/>
+          <w:bCs/>
+          <w:color w:val="0F4761"/>
+          <w:sz w:val="20"/>
+          <w:szCs w:val="20"/>
+        </w:rPr>
+        <w:t>Manage-workflow-</w:t>
+      </w:r>
+      <w:r>
+        <w:rPr>
+          <w:b/>
+          <w:bCs/>
+          <w:color w:val="0F4761"/>
+          <w:sz w:val="20"/>
+          <w:szCs w:val="20"/>
+        </w:rPr>
+        <w:t>status-selected</w:t>
+      </w:r>
+      <w:r>
+        <w:rPr>
+          <w:b/>
+          <w:bCs/>
+          <w:color w:val="0F4761"/>
+          <w:sz w:val="20"/>
+          <w:szCs w:val="20"/>
+        </w:rPr>
+        <w:t>.png</w:t>
+      </w:r>
+    </w:p>
+    <w:p>
+      <w:pPr>
+        <w:jc w:val="center"/>
+      </w:pPr>
+      <w:r>
+        <w:rPr>
+          <w:rFonts w:ascii="Consolas" w:hAnsi="Consolas" w:cs="Consolas"/>
+          <w:color w:val="9AA0A6"/>
           <w:sz w:val="16"/>
-        </w:rPr>
-        <w:t>manage-workflow-status-selected.png</w:t>
-      </w:r>
-    </w:p>
-    <w:p>
-      <w:r>
+          <w:szCs w:val="16"/>
+        </w:rPr>
+        <w:t>###########################</w:t>
+      </w:r>
+    </w:p>
+    <w:p>
+      <w:pPr>
+        <w:ind w:left="2160" w:firstLine="720"/>
+      </w:pPr>
+      <w:r>
+        <w:rPr>
+          <w:noProof/>
+        </w:rPr>
         <w:drawing>
           <wp:inline distT="0" distB="0" distL="0" distR="0" wp14:anchorId="5860C2E4" wp14:editId="13217CB9">
             <wp:extent cx="2229161" cy="1381318"/>
@@ -3828,34 +4176,210 @@
       </w:r>
     </w:p>
     <w:p>
-      <w:r>
-        <w:rPr>
-          <w:rFonts w:ascii="Consolas" w:eastAsia="Consolas" w:hAnsi="Consolas" w:cs="Consolas"/>
+      <w:pPr>
+        <w:jc w:val="center"/>
+        <w:rPr>
+          <w:rFonts w:ascii="Consolas" w:hAnsi="Consolas" w:cs="Consolas"/>
+          <w:color w:val="9AA0A6"/>
           <w:sz w:val="16"/>
-        </w:rPr>
+          <w:szCs w:val="16"/>
+        </w:rPr>
+      </w:pPr>
+    </w:p>
+    <w:p>
+      <w:pPr>
+        <w:jc w:val="center"/>
+        <w:rPr>
+          <w:rFonts w:ascii="Consolas" w:hAnsi="Consolas" w:cs="Consolas"/>
+          <w:color w:val="9AA0A6"/>
+          <w:sz w:val="16"/>
+          <w:szCs w:val="16"/>
+        </w:rPr>
+      </w:pPr>
+    </w:p>
+    <w:p>
+      <w:pPr>
+        <w:jc w:val="center"/>
+        <w:rPr>
+          <w:rFonts w:ascii="Consolas" w:hAnsi="Consolas" w:cs="Consolas"/>
+          <w:color w:val="9AA0A6"/>
+          <w:sz w:val="16"/>
+          <w:szCs w:val="16"/>
+        </w:rPr>
+      </w:pPr>
+    </w:p>
+    <w:p>
+      <w:pPr>
+        <w:jc w:val="center"/>
+        <w:rPr>
+          <w:rFonts w:ascii="Consolas" w:hAnsi="Consolas" w:cs="Consolas"/>
+          <w:color w:val="9AA0A6"/>
+          <w:sz w:val="16"/>
+          <w:szCs w:val="16"/>
+        </w:rPr>
+      </w:pPr>
+    </w:p>
+    <w:p>
+      <w:pPr>
+        <w:jc w:val="center"/>
+        <w:rPr>
+          <w:rFonts w:ascii="Consolas" w:hAnsi="Consolas" w:cs="Consolas"/>
+          <w:color w:val="9AA0A6"/>
+          <w:sz w:val="16"/>
+          <w:szCs w:val="16"/>
+        </w:rPr>
+      </w:pPr>
+    </w:p>
+    <w:p>
+      <w:pPr>
+        <w:jc w:val="center"/>
+        <w:rPr>
+          <w:rFonts w:ascii="Consolas" w:hAnsi="Consolas" w:cs="Consolas"/>
+          <w:color w:val="9AA0A6"/>
+          <w:sz w:val="16"/>
+          <w:szCs w:val="16"/>
+        </w:rPr>
+      </w:pPr>
+    </w:p>
+    <w:p>
+      <w:pPr>
+        <w:jc w:val="center"/>
+        <w:rPr>
+          <w:rFonts w:ascii="Consolas" w:hAnsi="Consolas" w:cs="Consolas"/>
+          <w:color w:val="9AA0A6"/>
+          <w:sz w:val="16"/>
+          <w:szCs w:val="16"/>
+        </w:rPr>
+      </w:pPr>
+    </w:p>
+    <w:p>
+      <w:pPr>
+        <w:jc w:val="center"/>
+        <w:rPr>
+          <w:rFonts w:ascii="Consolas" w:hAnsi="Consolas" w:cs="Consolas"/>
+          <w:color w:val="9AA0A6"/>
+          <w:sz w:val="16"/>
+          <w:szCs w:val="16"/>
+        </w:rPr>
+      </w:pPr>
+    </w:p>
+    <w:p>
+      <w:pPr>
+        <w:jc w:val="center"/>
+        <w:rPr>
+          <w:rFonts w:ascii="Consolas" w:hAnsi="Consolas" w:cs="Consolas"/>
+          <w:color w:val="9AA0A6"/>
+          <w:sz w:val="16"/>
+          <w:szCs w:val="16"/>
+        </w:rPr>
+      </w:pPr>
+    </w:p>
+    <w:p>
+      <w:pPr>
+        <w:jc w:val="center"/>
+        <w:rPr>
+          <w:rFonts w:ascii="Consolas" w:hAnsi="Consolas" w:cs="Consolas"/>
+          <w:color w:val="9AA0A6"/>
+          <w:sz w:val="16"/>
+          <w:szCs w:val="16"/>
+        </w:rPr>
+      </w:pPr>
+    </w:p>
+    <w:p>
+      <w:pPr>
+        <w:jc w:val="center"/>
+      </w:pPr>
+      <w:r>
+        <w:rPr>
+          <w:rFonts w:ascii="Consolas" w:hAnsi="Consolas" w:cs="Consolas"/>
+          <w:color w:val="9AA0A6"/>
+          <w:sz w:val="16"/>
+          <w:szCs w:val="16"/>
+        </w:rPr>
+        <w:lastRenderedPageBreak/>
         <w:t>###########################</w:t>
       </w:r>
     </w:p>
     <w:p>
       <w:pPr>
-        <w:pBdr>
-          <w:bottom w:val="thinThickThinMediumGap" w:sz="18" w:space="1" w:color="auto"/>
-        </w:pBdr>
-      </w:pPr>
-      <w:r>
-        <w:rPr>
-          <w:rFonts w:ascii="Consolas" w:eastAsia="Consolas" w:hAnsi="Consolas" w:cs="Consolas"/>
+        <w:jc w:val="center"/>
+      </w:pPr>
+      <w:r>
+        <w:rPr>
+          <w:b/>
+          <w:bCs/>
+          <w:color w:val="0F4761"/>
+          <w:sz w:val="20"/>
+          <w:szCs w:val="20"/>
+        </w:rPr>
+        <w:t>Manage-workflow-</w:t>
+      </w:r>
+      <w:r>
+        <w:rPr>
+          <w:b/>
+          <w:bCs/>
+          <w:color w:val="0F4761"/>
+          <w:sz w:val="20"/>
+          <w:szCs w:val="20"/>
+        </w:rPr>
+        <w:t>create</w:t>
+      </w:r>
+      <w:r>
+        <w:rPr>
+          <w:b/>
+          <w:bCs/>
+          <w:color w:val="0F4761"/>
+          <w:sz w:val="20"/>
+          <w:szCs w:val="20"/>
+        </w:rPr>
+        <w:t>-</w:t>
+      </w:r>
+      <w:r>
+        <w:rPr>
+          <w:b/>
+          <w:bCs/>
+          <w:color w:val="0F4761"/>
+          <w:sz w:val="20"/>
+          <w:szCs w:val="20"/>
+        </w:rPr>
+        <w:t>transition</w:t>
+      </w:r>
+      <w:r>
+        <w:rPr>
+          <w:b/>
+          <w:bCs/>
+          <w:color w:val="0F4761"/>
+          <w:sz w:val="20"/>
+          <w:szCs w:val="20"/>
+        </w:rPr>
+        <w:t>.png</w:t>
+      </w:r>
+    </w:p>
+    <w:p>
+      <w:pPr>
+        <w:jc w:val="center"/>
+      </w:pPr>
+      <w:r>
+        <w:rPr>
+          <w:rFonts w:ascii="Consolas" w:hAnsi="Consolas" w:cs="Consolas"/>
+          <w:color w:val="9AA0A6"/>
           <w:sz w:val="16"/>
-        </w:rPr>
-        <w:t>manage-workflow-create-transition.png</w:t>
-      </w:r>
-    </w:p>
-    <w:p>
-      <w:r>
-        <w:lastRenderedPageBreak/>
+          <w:szCs w:val="16"/>
+        </w:rPr>
+        <w:t>###########################</w:t>
+      </w:r>
+    </w:p>
+    <w:p>
+      <w:pPr>
+        <w:ind w:left="1440" w:firstLine="720"/>
+      </w:pPr>
+      <w:r>
+        <w:rPr>
+          <w:noProof/>
+        </w:rPr>
         <w:drawing>
-          <wp:inline distT="0" distB="0" distL="0" distR="0" wp14:anchorId="53F2B99F" wp14:editId="373B09BA">
-            <wp:extent cx="5943600" cy="2282825"/>
+          <wp:inline distT="0" distB="0" distL="0" distR="0" wp14:anchorId="53F2B99F" wp14:editId="64D9162D">
+            <wp:extent cx="3093720" cy="2282825"/>
             <wp:effectExtent l="0" t="0" r="0" b="3175"/>
             <wp:docPr id="271492176" name="Picture 1"/>
             <wp:cNvGraphicFramePr>
@@ -3868,20 +4392,29 @@
                     <pic:cNvPr id="271492176" name=""/>
                     <pic:cNvPicPr/>
                   </pic:nvPicPr>
-                  <pic:blipFill>
+                  <pic:blipFill rotWithShape="1">
                     <a:blip r:embed="rId11"/>
+                    <a:srcRect l="36923" r="11026"/>
                     <a:stretch>
                       <a:fillRect/>
                     </a:stretch>
                   </pic:blipFill>
-                  <pic:spPr>
+                  <pic:spPr bwMode="auto">
                     <a:xfrm>
                       <a:off x="0" y="0"/>
-                      <a:ext cx="5943600" cy="2282825"/>
+                      <a:ext cx="3093720" cy="2282825"/>
                     </a:xfrm>
                     <a:prstGeom prst="rect">
                       <a:avLst/>
                     </a:prstGeom>
+                    <a:ln>
+                      <a:noFill/>
+                    </a:ln>
+                    <a:extLst>
+                      <a:ext uri="{53640926-AAD7-44D8-BBD7-CCE9431645EC}">
+                        <a14:shadowObscured xmlns:a14="http://schemas.microsoft.com/office/drawing/2010/main"/>
+                      </a:ext>
+                    </a:extLst>
                   </pic:spPr>
                 </pic:pic>
               </a:graphicData>
@@ -3893,89 +4426,130 @@
     <w:p>
       <w:pPr>
         <w:jc w:val="center"/>
-      </w:pPr>
-      <w:r>
         <w:rPr>
           <w:i/>
           <w:color w:val="6B778C"/>
           <w:sz w:val="18"/>
         </w:rPr>
+      </w:pPr>
+      <w:r>
+        <w:rPr>
+          <w:i/>
+          <w:color w:val="6B778C"/>
+          <w:sz w:val="18"/>
+        </w:rPr>
         <w:t>The Create Transition dialog after selecting two nodes: “From → To” badges and a Transition Name field with Cancel / Create Transition.</w:t>
       </w:r>
     </w:p>
     <w:p>
-      <w:r>
-        <w:rPr>
-          <w:rFonts w:ascii="Consolas" w:eastAsia="Consolas" w:hAnsi="Consolas" w:cs="Consolas"/>
+      <w:pPr>
+        <w:pStyle w:val="Heading3"/>
+      </w:pPr>
+      <w:r>
+        <w:t>3.6 Transition detail panel</w:t>
+      </w:r>
+    </w:p>
+    <w:p>
+      <w:r>
+        <w:t>Clicking an arrow opens the detail panel: Name, Id, From / To status badges, Record Status badge, and Created Date. While the transition is pending an Activate action is shown; Delete (with a confirm prompt) soft-deletes it; Close dismisses the panel. The panel also hosts Add Validation Rule and Show / Hide Validation Details.</w:t>
+      </w:r>
+    </w:p>
+    <w:p>
+      <w:pPr>
+        <w:jc w:val="center"/>
+      </w:pPr>
+      <w:r>
+        <w:rPr>
+          <w:rFonts w:ascii="Consolas" w:hAnsi="Consolas" w:cs="Consolas"/>
+          <w:color w:val="9AA0A6"/>
           <w:sz w:val="16"/>
+          <w:szCs w:val="16"/>
         </w:rPr>
         <w:t>###########################</w:t>
       </w:r>
     </w:p>
     <w:p>
-      <w:r>
-        <w:rPr>
-          <w:rFonts w:ascii="Consolas" w:eastAsia="Consolas" w:hAnsi="Consolas" w:cs="Consolas"/>
+      <w:pPr>
+        <w:jc w:val="center"/>
+      </w:pPr>
+      <w:r>
+        <w:rPr>
+          <w:b/>
+          <w:bCs/>
+          <w:color w:val="0F4761"/>
+          <w:sz w:val="20"/>
+          <w:szCs w:val="20"/>
+        </w:rPr>
+        <w:t>Manage-workflow-</w:t>
+      </w:r>
+      <w:r>
+        <w:rPr>
+          <w:b/>
+          <w:bCs/>
+          <w:color w:val="0F4761"/>
+          <w:sz w:val="20"/>
+          <w:szCs w:val="20"/>
+        </w:rPr>
+        <w:t>transition</w:t>
+      </w:r>
+      <w:r>
+        <w:rPr>
+          <w:b/>
+          <w:bCs/>
+          <w:color w:val="0F4761"/>
+          <w:sz w:val="20"/>
+          <w:szCs w:val="20"/>
+        </w:rPr>
+        <w:t>-</w:t>
+      </w:r>
+      <w:r>
+        <w:rPr>
+          <w:b/>
+          <w:bCs/>
+          <w:color w:val="0F4761"/>
+          <w:sz w:val="20"/>
+          <w:szCs w:val="20"/>
+        </w:rPr>
+        <w:t>detail</w:t>
+      </w:r>
+      <w:r>
+        <w:rPr>
+          <w:b/>
+          <w:bCs/>
+          <w:color w:val="0F4761"/>
+          <w:sz w:val="20"/>
+          <w:szCs w:val="20"/>
+        </w:rPr>
+        <w:t>.png</w:t>
+      </w:r>
+    </w:p>
+    <w:p>
+      <w:pPr>
+        <w:jc w:val="center"/>
+      </w:pPr>
+      <w:r>
+        <w:rPr>
+          <w:rFonts w:ascii="Consolas" w:hAnsi="Consolas" w:cs="Consolas"/>
+          <w:color w:val="9AA0A6"/>
           <w:sz w:val="16"/>
-        </w:rPr>
-        <w:t>manage-workflow-create-transition.png</w:t>
-      </w:r>
-    </w:p>
-    <w:p>
-      <w:r>
-        <w:rPr>
-          <w:rFonts w:ascii="Consolas" w:eastAsia="Consolas" w:hAnsi="Consolas" w:cs="Consolas"/>
-          <w:sz w:val="16"/>
+          <w:szCs w:val="16"/>
         </w:rPr>
         <w:t>###########################</w:t>
       </w:r>
     </w:p>
-    <w:p>
-      <w:pPr>
-        <w:pStyle w:val="Heading3"/>
-      </w:pPr>
-      <w:r>
-        <w:t>3</w:t>
-      </w:r>
-      <w:r>
-        <w:t>.6 Transition detail panel</w:t>
-      </w:r>
-    </w:p>
-    <w:p>
-      <w:r>
-        <w:t>Clicking an arrow opens the detail panel: Name, Id, From / To status badges, Record Status badge, and Created Date. While the transition is pending an Activate action is shown; Delete (with a confirm prompt) soft-deletes it; Close dismisses the panel. The panel also hosts Add Validation Rule and Show / Hide Validation Details.</w:t>
-      </w:r>
-    </w:p>
-    <w:p>
-      <w:r>
-        <w:rPr>
-          <w:rFonts w:ascii="Consolas" w:eastAsia="Consolas" w:hAnsi="Consolas" w:cs="Consolas"/>
-          <w:sz w:val="16"/>
-        </w:rPr>
-        <w:t>###########################</w:t>
-      </w:r>
-    </w:p>
-    <w:p>
-      <w:pPr>
-        <w:pBdr>
-          <w:bottom w:val="thinThickThinMediumGap" w:sz="18" w:space="1" w:color="auto"/>
-        </w:pBdr>
-      </w:pPr>
-      <w:r>
-        <w:rPr>
-          <w:rFonts w:ascii="Consolas" w:eastAsia="Consolas" w:hAnsi="Consolas" w:cs="Consolas"/>
-          <w:sz w:val="16"/>
-        </w:rPr>
-        <w:t>manage-workflow-transition-detail.png</w:t>
-      </w:r>
-    </w:p>
-    <w:p>
-      <w:r>
-        <w:lastRenderedPageBreak/>
+    <w:p/>
+    <w:p>
+      <w:pPr>
+        <w:ind w:left="1440" w:firstLine="720"/>
+      </w:pPr>
+      <w:r>
+        <w:rPr>
+          <w:noProof/>
+        </w:rPr>
         <w:drawing>
-          <wp:inline distT="0" distB="0" distL="0" distR="0" wp14:anchorId="1D741C9E" wp14:editId="0C250163">
-            <wp:extent cx="5943600" cy="6073775"/>
-            <wp:effectExtent l="0" t="0" r="0" b="3175"/>
+          <wp:inline distT="0" distB="0" distL="0" distR="0" wp14:anchorId="1D741C9E" wp14:editId="0E452C27">
+            <wp:extent cx="3489960" cy="3566396"/>
+            <wp:effectExtent l="0" t="0" r="0" b="0"/>
             <wp:docPr id="1555001451" name="Picture 1"/>
             <wp:cNvGraphicFramePr>
               <a:graphicFrameLocks xmlns:a="http://schemas.openxmlformats.org/drawingml/2006/main" noChangeAspect="1"/>
@@ -3996,7 +4570,7 @@
                   <pic:spPr>
                     <a:xfrm>
                       <a:off x="0" y="0"/>
-                      <a:ext cx="5943600" cy="6073775"/>
+                      <a:ext cx="3544024" cy="3621644"/>
                     </a:xfrm>
                     <a:prstGeom prst="rect">
                       <a:avLst/>
@@ -4011,122 +4585,145 @@
     </w:p>
     <w:p>
       <w:pPr>
+        <w:pStyle w:val="Heading3"/>
+      </w:pPr>
+      <w:r>
+        <w:lastRenderedPageBreak/>
+        <w:t>3.7 Validation rules</w:t>
+      </w:r>
+    </w:p>
+    <w:p>
+      <w:r>
+        <w:t xml:space="preserve">Add Validation Rule opens an inline section with a Field API Name </w:t>
+      </w:r>
+      <w:proofErr w:type="spellStart"/>
+      <w:r>
+        <w:t>combobox</w:t>
+      </w:r>
+      <w:proofErr w:type="spellEnd"/>
+      <w:r>
+        <w:t xml:space="preserve"> (mirroring the </w:t>
+      </w:r>
+      <w:proofErr w:type="spellStart"/>
+      <w:r>
+        <w:t>ValidateField</w:t>
+      </w:r>
+      <w:proofErr w:type="spellEnd"/>
+      <w:r>
+        <w:t xml:space="preserve">__c field picklist) and a Validation Type </w:t>
+      </w:r>
+      <w:proofErr w:type="spellStart"/>
+      <w:r>
+        <w:t>combobox</w:t>
+      </w:r>
+      <w:proofErr w:type="spellEnd"/>
+      <w:r>
+        <w:t xml:space="preserve">; Create persists the rule and folds it onto the transition. Show Validation Details expands the rule list (loaded on expand via </w:t>
+      </w:r>
+      <w:proofErr w:type="spellStart"/>
+      <w:r>
+        <w:t>loadValidateFields</w:t>
+      </w:r>
+      <w:proofErr w:type="spellEnd"/>
+      <w:r>
+        <w:t>); an empty transition shows “No validation details for this transition.”</w:t>
+      </w:r>
+    </w:p>
+    <w:p>
+      <w:pPr>
         <w:jc w:val="center"/>
       </w:pPr>
       <w:r>
         <w:rPr>
-          <w:i/>
-          <w:color w:val="6B778C"/>
-          <w:sz w:val="18"/>
-        </w:rPr>
-        <w:t>The transition detail panel: Name / Id / From / To / Record Status / Created Date, with Activate (pending) · Delete · Close and the Add Validation Rule / Show Validation Details controls.</w:t>
-      </w:r>
-    </w:p>
-    <w:p>
-      <w:r>
-        <w:rPr>
-          <w:rFonts w:ascii="Consolas" w:eastAsia="Consolas" w:hAnsi="Consolas" w:cs="Consolas"/>
+          <w:rFonts w:ascii="Consolas" w:hAnsi="Consolas" w:cs="Consolas"/>
+          <w:color w:val="9AA0A6"/>
           <w:sz w:val="16"/>
+          <w:szCs w:val="16"/>
         </w:rPr>
         <w:t>###########################</w:t>
       </w:r>
     </w:p>
     <w:p>
-      <w:r>
-        <w:rPr>
-          <w:rFonts w:ascii="Consolas" w:eastAsia="Consolas" w:hAnsi="Consolas" w:cs="Consolas"/>
+      <w:pPr>
+        <w:jc w:val="center"/>
+      </w:pPr>
+      <w:r>
+        <w:rPr>
+          <w:b/>
+          <w:bCs/>
+          <w:color w:val="0F4761"/>
+          <w:sz w:val="20"/>
+          <w:szCs w:val="20"/>
+        </w:rPr>
+        <w:t>Manage-workflow-</w:t>
+      </w:r>
+      <w:r>
+        <w:rPr>
+          <w:b/>
+          <w:bCs/>
+          <w:color w:val="0F4761"/>
+          <w:sz w:val="20"/>
+          <w:szCs w:val="20"/>
+        </w:rPr>
+        <w:t>add</w:t>
+      </w:r>
+      <w:r>
+        <w:rPr>
+          <w:b/>
+          <w:bCs/>
+          <w:color w:val="0F4761"/>
+          <w:sz w:val="20"/>
+          <w:szCs w:val="20"/>
+        </w:rPr>
+        <w:t>-</w:t>
+      </w:r>
+      <w:r>
+        <w:rPr>
+          <w:b/>
+          <w:bCs/>
+          <w:color w:val="0F4761"/>
+          <w:sz w:val="20"/>
+          <w:szCs w:val="20"/>
+        </w:rPr>
+        <w:t>validation-rule</w:t>
+      </w:r>
+      <w:r>
+        <w:rPr>
+          <w:b/>
+          <w:bCs/>
+          <w:color w:val="0F4761"/>
+          <w:sz w:val="20"/>
+          <w:szCs w:val="20"/>
+        </w:rPr>
+        <w:t>.png</w:t>
+      </w:r>
+    </w:p>
+    <w:p>
+      <w:pPr>
+        <w:jc w:val="center"/>
+      </w:pPr>
+      <w:r>
+        <w:rPr>
+          <w:rFonts w:ascii="Consolas" w:hAnsi="Consolas" w:cs="Consolas"/>
+          <w:color w:val="9AA0A6"/>
           <w:sz w:val="16"/>
-        </w:rPr>
-        <w:t>manage-workflow-transition-detail.png</w:t>
-      </w:r>
-    </w:p>
-    <w:p>
-      <w:r>
-        <w:rPr>
-          <w:rFonts w:ascii="Consolas" w:eastAsia="Consolas" w:hAnsi="Consolas" w:cs="Consolas"/>
-          <w:sz w:val="16"/>
+          <w:szCs w:val="16"/>
         </w:rPr>
         <w:t>###########################</w:t>
       </w:r>
     </w:p>
     <w:p>
       <w:pPr>
-        <w:pStyle w:val="Heading3"/>
-      </w:pPr>
-      <w:r>
-        <w:t>3</w:t>
-      </w:r>
-      <w:r>
-        <w:t>.7 Validation rules</w:t>
-      </w:r>
-    </w:p>
-    <w:p>
-      <w:r>
-        <w:t xml:space="preserve">Add Validation Rule opens an inline section with a Field API Name </w:t>
-      </w:r>
-      <w:proofErr w:type="spellStart"/>
-      <w:r>
-        <w:t>combobox</w:t>
-      </w:r>
-      <w:proofErr w:type="spellEnd"/>
-      <w:r>
-        <w:t xml:space="preserve"> (mirroring the </w:t>
-      </w:r>
-      <w:proofErr w:type="spellStart"/>
-      <w:r>
-        <w:t>ValidateField</w:t>
-      </w:r>
-      <w:proofErr w:type="spellEnd"/>
-      <w:r>
-        <w:t xml:space="preserve">__c field picklist) and a Validation Type </w:t>
-      </w:r>
-      <w:proofErr w:type="spellStart"/>
-      <w:r>
-        <w:t>combobox</w:t>
-      </w:r>
-      <w:proofErr w:type="spellEnd"/>
-      <w:r>
-        <w:t xml:space="preserve">; Create persists the rule and folds it onto the transition. Show Validation Details expands the rule list (loaded on expand via </w:t>
-      </w:r>
-      <w:proofErr w:type="spellStart"/>
-      <w:r>
-        <w:t>loadValidateFields</w:t>
-      </w:r>
-      <w:proofErr w:type="spellEnd"/>
-      <w:r>
-        <w:t>); an empty transition shows “No validation details for this transition.”</w:t>
-      </w:r>
-    </w:p>
-    <w:p>
-      <w:r>
-        <w:rPr>
-          <w:rFonts w:ascii="Consolas" w:eastAsia="Consolas" w:hAnsi="Consolas" w:cs="Consolas"/>
-          <w:sz w:val="16"/>
-        </w:rPr>
-        <w:t>###########################</w:t>
-      </w:r>
-    </w:p>
-    <w:p>
-      <w:pPr>
-        <w:pBdr>
-          <w:bottom w:val="thinThickThinMediumGap" w:sz="18" w:space="1" w:color="auto"/>
-        </w:pBdr>
-      </w:pPr>
-      <w:r>
-        <w:rPr>
-          <w:rFonts w:ascii="Consolas" w:eastAsia="Consolas" w:hAnsi="Consolas" w:cs="Consolas"/>
-          <w:sz w:val="16"/>
-        </w:rPr>
-        <w:lastRenderedPageBreak/>
-        <w:t>manage-workflow-add-validation-rule.png</w:t>
-      </w:r>
-    </w:p>
-    <w:p>
-      <w:r>
+        <w:ind w:firstLine="720"/>
+      </w:pPr>
+      <w:r>
+        <w:rPr>
+          <w:noProof/>
+        </w:rPr>
         <w:drawing>
-          <wp:inline distT="0" distB="0" distL="0" distR="0" wp14:anchorId="2BE0C478" wp14:editId="6DE36509">
-            <wp:extent cx="5943600" cy="4330065"/>
-            <wp:effectExtent l="0" t="0" r="0" b="0"/>
+          <wp:inline distT="0" distB="0" distL="0" distR="0" wp14:anchorId="2BE0C478" wp14:editId="45968B23">
+            <wp:extent cx="4907280" cy="3575079"/>
+            <wp:effectExtent l="0" t="0" r="7620" b="6350"/>
             <wp:docPr id="55860637" name="Picture 1"/>
             <wp:cNvGraphicFramePr>
               <a:graphicFrameLocks xmlns:a="http://schemas.openxmlformats.org/drawingml/2006/main" noChangeAspect="1"/>
@@ -4147,7 +4744,7 @@
                   <pic:spPr>
                     <a:xfrm>
                       <a:off x="0" y="0"/>
-                      <a:ext cx="5943600" cy="4330065"/>
+                      <a:ext cx="4913955" cy="3579942"/>
                     </a:xfrm>
                     <a:prstGeom prst="rect">
                       <a:avLst/>
@@ -4194,28 +4791,8 @@
     <w:p>
       <w:r>
         <w:rPr>
-          <w:rFonts w:ascii="Consolas" w:eastAsia="Consolas" w:hAnsi="Consolas" w:cs="Consolas"/>
-          <w:sz w:val="16"/>
-        </w:rPr>
-        <w:t>###########################</w:t>
-      </w:r>
-    </w:p>
-    <w:p>
-      <w:pPr>
-        <w:pBdr>
-          <w:bottom w:val="thinThickThinMediumGap" w:sz="18" w:space="1" w:color="auto"/>
-        </w:pBdr>
-      </w:pPr>
-      <w:r>
-        <w:rPr>
-          <w:rFonts w:ascii="Consolas" w:eastAsia="Consolas" w:hAnsi="Consolas" w:cs="Consolas"/>
-          <w:sz w:val="16"/>
-        </w:rPr>
-        <w:t>manage-workflow-validation-details.png</w:t>
-      </w:r>
-    </w:p>
-    <w:p>
-      <w:r>
+          <w:noProof/>
+        </w:rPr>
         <w:drawing>
           <wp:inline distT="0" distB="0" distL="0" distR="0" wp14:anchorId="33DAE513" wp14:editId="30CB519E">
             <wp:extent cx="5943600" cy="2435225"/>
@@ -4276,10 +4853,7 @@
         <w:pStyle w:val="Heading2"/>
       </w:pPr>
       <w:r>
-        <w:t>4</w:t>
-      </w:r>
-      <w:r>
-        <w:t>. Traceability (SRS → API)</w:t>
+        <w:t>4. Traceability (SRS → API)</w:t>
       </w:r>
     </w:p>
     <w:tbl>
@@ -5756,7 +6330,7 @@
   <w:style w:type="paragraph" w:default="1" w:styleId="Normal">
     <w:name w:val="Normal"/>
     <w:qFormat/>
-    <w:rsid w:val="00EA0CBC"/>
+    <w:rsid w:val="00A608CD"/>
   </w:style>
   <w:style w:type="paragraph" w:styleId="Heading1">
     <w:name w:val="heading 1"/>
@@ -5968,6 +6542,66 @@
       <w:sz w:val="20"/>
       <w:szCs w:val="20"/>
     </w:rPr>
+  </w:style>
+  <w:style w:type="table" w:styleId="PlainTable1">
+    <w:name w:val="Plain Table 1"/>
+    <w:basedOn w:val="TableNormal"/>
+    <w:uiPriority w:val="41"/>
+    <w:rsid w:val="002C774D"/>
+    <w:tblPr>
+      <w:tblStyleRowBandSize w:val="1"/>
+      <w:tblStyleColBandSize w:val="1"/>
+      <w:tblBorders>
+        <w:top w:val="single" w:sz="4" w:space="0" w:color="BFBFBF" w:themeColor="background1" w:themeShade="BF"/>
+        <w:left w:val="single" w:sz="4" w:space="0" w:color="BFBFBF" w:themeColor="background1" w:themeShade="BF"/>
+        <w:bottom w:val="single" w:sz="4" w:space="0" w:color="BFBFBF" w:themeColor="background1" w:themeShade="BF"/>
+        <w:right w:val="single" w:sz="4" w:space="0" w:color="BFBFBF" w:themeColor="background1" w:themeShade="BF"/>
+        <w:insideH w:val="single" w:sz="4" w:space="0" w:color="BFBFBF" w:themeColor="background1" w:themeShade="BF"/>
+        <w:insideV w:val="single" w:sz="4" w:space="0" w:color="BFBFBF" w:themeColor="background1" w:themeShade="BF"/>
+      </w:tblBorders>
+    </w:tblPr>
+    <w:tblStylePr w:type="firstRow">
+      <w:rPr>
+        <w:b/>
+        <w:bCs/>
+      </w:rPr>
+    </w:tblStylePr>
+    <w:tblStylePr w:type="lastRow">
+      <w:rPr>
+        <w:b/>
+        <w:bCs/>
+      </w:rPr>
+      <w:tblPr/>
+      <w:tcPr>
+        <w:tcBorders>
+          <w:top w:val="double" w:sz="4" w:space="0" w:color="BFBFBF" w:themeColor="background1" w:themeShade="BF"/>
+        </w:tcBorders>
+      </w:tcPr>
+    </w:tblStylePr>
+    <w:tblStylePr w:type="firstCol">
+      <w:rPr>
+        <w:b/>
+        <w:bCs/>
+      </w:rPr>
+    </w:tblStylePr>
+    <w:tblStylePr w:type="lastCol">
+      <w:rPr>
+        <w:b/>
+        <w:bCs/>
+      </w:rPr>
+    </w:tblStylePr>
+    <w:tblStylePr w:type="band1Vert">
+      <w:tblPr/>
+      <w:tcPr>
+        <w:shd w:val="clear" w:color="auto" w:fill="F2F2F2" w:themeFill="background1" w:themeFillShade="F2"/>
+      </w:tcPr>
+    </w:tblStylePr>
+    <w:tblStylePr w:type="band1Horz">
+      <w:tblPr/>
+      <w:tcPr>
+        <w:shd w:val="clear" w:color="auto" w:fill="F2F2F2" w:themeFill="background1" w:themeFillShade="F2"/>
+      </w:tcPr>
+    </w:tblStylePr>
   </w:style>
 </w:styles>
 </file>

</xml_diff>